<commit_message>
Deployment hardening + Tracking/Dashboard UX fixes
- Remove hardcoded admin@example.com/password123 seed from initDb() and main.py
- Add BOOTSTRAP_ADMIN_EMAIL env var that promotes an existing account at boot (idempotent, never creates accounts)
- Clear default credentials from Login form
- Tracking: TZ-safe cast of DATE columns to text in SQL (fixes off-by-one day on optimization start date); drop restrictive frontend max on date input; replace blocking "insufficient history" error with a subtle "comparaison sous 1-2 j" hint
- Dashboard: drop non-actionable "Section Alertes" (3 static counters duplicating info available elsewhere)
- Update CLAUDE.md with the new admin bootstrap procedure

Co-Authored-By: Claude Opus 4.7 <noreply@anthropic.com>
</commit_message>
<xml_diff>
--- a/rapport pfe.docx
+++ b/rapport pfe.docx
@@ -4033,30 +4033,66 @@
           <w:sz w:val="20"/>
         </w:rPr>
         <w:drawing>
-          <wp:anchor distT="0" distB="0" distL="0" distR="0" simplePos="0" relativeHeight="487587840" behindDoc="1" locked="0" layoutInCell="1" allowOverlap="1" wp14:anchorId="233CD0FF" wp14:editId="6F2A9C5A">
+          <wp:anchor distT="0" distB="0" distL="114300" distR="114300" simplePos="0" relativeHeight="487591936" behindDoc="1" locked="0" layoutInCell="1" allowOverlap="1" wp14:anchorId="3DCFBFF5" wp14:editId="2C2B055D">
             <wp:simplePos x="0" y="0"/>
-            <wp:positionH relativeFrom="page">
-              <wp:posOffset>2094074</wp:posOffset>
+            <wp:positionH relativeFrom="column">
+              <wp:posOffset>1663065</wp:posOffset>
             </wp:positionH>
             <wp:positionV relativeFrom="paragraph">
-              <wp:posOffset>226961</wp:posOffset>
+              <wp:posOffset>92710</wp:posOffset>
             </wp:positionV>
-            <wp:extent cx="3356729" cy="2114550"/>
+            <wp:extent cx="4057650" cy="2112120"/>
             <wp:effectExtent l="0" t="0" r="0" b="0"/>
-            <wp:wrapTopAndBottom/>
-            <wp:docPr id="1" name="Image 1"/>
+            <wp:wrapTight wrapText="bothSides">
+              <wp:wrapPolygon edited="0">
+                <wp:start x="12473" y="0"/>
+                <wp:lineTo x="10546" y="1364"/>
+                <wp:lineTo x="9735" y="2338"/>
+                <wp:lineTo x="9735" y="3117"/>
+                <wp:lineTo x="6794" y="4481"/>
+                <wp:lineTo x="6896" y="6235"/>
+                <wp:lineTo x="913" y="6429"/>
+                <wp:lineTo x="1014" y="12469"/>
+                <wp:lineTo x="1623" y="15586"/>
+                <wp:lineTo x="1623" y="16171"/>
+                <wp:lineTo x="2535" y="18704"/>
+                <wp:lineTo x="2738" y="19093"/>
+                <wp:lineTo x="5172" y="20457"/>
+                <wp:lineTo x="7707" y="20457"/>
+                <wp:lineTo x="8315" y="20067"/>
+                <wp:lineTo x="11256" y="18898"/>
+                <wp:lineTo x="11561" y="18704"/>
+                <wp:lineTo x="15110" y="15781"/>
+                <wp:lineTo x="17239" y="15586"/>
+                <wp:lineTo x="19977" y="13833"/>
+                <wp:lineTo x="19876" y="10716"/>
+                <wp:lineTo x="19673" y="9352"/>
+                <wp:lineTo x="20485" y="6235"/>
+                <wp:lineTo x="20586" y="1364"/>
+                <wp:lineTo x="17341" y="0"/>
+                <wp:lineTo x="12980" y="0"/>
+                <wp:lineTo x="12473" y="0"/>
+              </wp:wrapPolygon>
+            </wp:wrapTight>
+            <wp:docPr id="364671612" name="Image 1"/>
             <wp:cNvGraphicFramePr>
-              <a:graphicFrameLocks xmlns:a="http://schemas.openxmlformats.org/drawingml/2006/main"/>
+              <a:graphicFrameLocks xmlns:a="http://schemas.openxmlformats.org/drawingml/2006/main" noChangeAspect="1"/>
             </wp:cNvGraphicFramePr>
             <a:graphic xmlns:a="http://schemas.openxmlformats.org/drawingml/2006/main">
               <a:graphicData uri="http://schemas.openxmlformats.org/drawingml/2006/picture">
                 <pic:pic xmlns:pic="http://schemas.openxmlformats.org/drawingml/2006/picture">
                   <pic:nvPicPr>
-                    <pic:cNvPr id="1" name="Image 1"/>
+                    <pic:cNvPr id="364671612" name="Image 364671612"/>
                     <pic:cNvPicPr/>
                   </pic:nvPicPr>
                   <pic:blipFill>
-                    <a:blip r:embed="rId5" cstate="print"/>
+                    <a:blip r:embed="rId5">
+                      <a:extLst>
+                        <a:ext uri="{28A0092B-C50C-407E-A947-70E740481C1C}">
+                          <a14:useLocalDpi xmlns:a14="http://schemas.microsoft.com/office/drawing/2010/main" val="0"/>
+                        </a:ext>
+                      </a:extLst>
+                    </a:blip>
                     <a:stretch>
                       <a:fillRect/>
                     </a:stretch>
@@ -4064,7 +4100,7 @@
                   <pic:spPr>
                     <a:xfrm>
                       <a:off x="0" y="0"/>
-                      <a:ext cx="3356729" cy="2114550"/>
+                      <a:ext cx="4057650" cy="2112120"/>
                     </a:xfrm>
                     <a:prstGeom prst="rect">
                       <a:avLst/>
@@ -4081,6 +4117,138 @@
       <w:pPr>
         <w:pStyle w:val="Corpsdetexte"/>
         <w:spacing w:before="72"/>
+      </w:pPr>
+    </w:p>
+    <w:p>
+      <w:pPr>
+        <w:ind w:left="324" w:right="1347"/>
+        <w:jc w:val="center"/>
+        <w:rPr>
+          <w:b/>
+          <w:color w:val="1F243C"/>
+          <w:sz w:val="24"/>
+          <w:u w:val="single" w:color="1F243C"/>
+        </w:rPr>
+      </w:pPr>
+    </w:p>
+    <w:p>
+      <w:pPr>
+        <w:ind w:left="324" w:right="1347"/>
+        <w:jc w:val="center"/>
+        <w:rPr>
+          <w:b/>
+          <w:color w:val="1F243C"/>
+          <w:sz w:val="24"/>
+          <w:u w:val="single" w:color="1F243C"/>
+        </w:rPr>
+      </w:pPr>
+    </w:p>
+    <w:p>
+      <w:pPr>
+        <w:ind w:left="324" w:right="1347"/>
+        <w:jc w:val="center"/>
+        <w:rPr>
+          <w:b/>
+          <w:color w:val="1F243C"/>
+          <w:sz w:val="24"/>
+          <w:u w:val="single" w:color="1F243C"/>
+        </w:rPr>
+      </w:pPr>
+    </w:p>
+    <w:p>
+      <w:pPr>
+        <w:ind w:left="324" w:right="1347"/>
+        <w:jc w:val="center"/>
+        <w:rPr>
+          <w:b/>
+          <w:color w:val="1F243C"/>
+          <w:sz w:val="24"/>
+          <w:u w:val="single" w:color="1F243C"/>
+        </w:rPr>
+      </w:pPr>
+    </w:p>
+    <w:p>
+      <w:pPr>
+        <w:ind w:left="324" w:right="1347"/>
+        <w:jc w:val="center"/>
+        <w:rPr>
+          <w:b/>
+          <w:color w:val="1F243C"/>
+          <w:sz w:val="24"/>
+          <w:u w:val="single" w:color="1F243C"/>
+        </w:rPr>
+      </w:pPr>
+    </w:p>
+    <w:p>
+      <w:pPr>
+        <w:ind w:left="324" w:right="1347"/>
+        <w:jc w:val="center"/>
+        <w:rPr>
+          <w:b/>
+          <w:color w:val="1F243C"/>
+          <w:sz w:val="24"/>
+          <w:u w:val="single" w:color="1F243C"/>
+        </w:rPr>
+      </w:pPr>
+    </w:p>
+    <w:p>
+      <w:pPr>
+        <w:ind w:left="324" w:right="1347"/>
+        <w:jc w:val="center"/>
+        <w:rPr>
+          <w:b/>
+          <w:color w:val="1F243C"/>
+          <w:sz w:val="24"/>
+          <w:u w:val="single" w:color="1F243C"/>
+        </w:rPr>
+      </w:pPr>
+    </w:p>
+    <w:p>
+      <w:pPr>
+        <w:ind w:left="324" w:right="1347"/>
+        <w:jc w:val="center"/>
+        <w:rPr>
+          <w:b/>
+          <w:color w:val="1F243C"/>
+          <w:sz w:val="24"/>
+          <w:u w:val="single" w:color="1F243C"/>
+        </w:rPr>
+      </w:pPr>
+    </w:p>
+    <w:p>
+      <w:pPr>
+        <w:ind w:left="324" w:right="1347"/>
+        <w:jc w:val="center"/>
+        <w:rPr>
+          <w:b/>
+          <w:color w:val="1F243C"/>
+          <w:sz w:val="24"/>
+          <w:u w:val="single" w:color="1F243C"/>
+        </w:rPr>
+      </w:pPr>
+    </w:p>
+    <w:p>
+      <w:pPr>
+        <w:ind w:left="324" w:right="1347"/>
+        <w:jc w:val="center"/>
+        <w:rPr>
+          <w:b/>
+          <w:color w:val="1F243C"/>
+          <w:sz w:val="24"/>
+          <w:u w:val="single" w:color="1F243C"/>
+        </w:rPr>
+      </w:pPr>
+    </w:p>
+    <w:p>
+      <w:pPr>
+        <w:ind w:left="324" w:right="1347"/>
+        <w:jc w:val="center"/>
+        <w:rPr>
+          <w:b/>
+          <w:color w:val="1F243C"/>
+          <w:sz w:val="24"/>
+          <w:u w:val="single" w:color="1F243C"/>
+        </w:rPr>
       </w:pPr>
     </w:p>
     <w:p>
@@ -12179,6 +12347,7 @@
     <w:p>
       <w:pPr>
         <w:pStyle w:val="Corpsdetexte"/>
+        <w:spacing w:before="152"/>
         <w:rPr>
           <w:sz w:val="28"/>
         </w:rPr>
@@ -12186,61 +12355,3633 @@
     </w:p>
     <w:p>
       <w:pPr>
-        <w:pStyle w:val="Corpsdetexte"/>
-        <w:rPr>
-          <w:sz w:val="28"/>
-        </w:rPr>
-      </w:pPr>
+        <w:pStyle w:val="Titre3"/>
+      </w:pPr>
+      <w:r>
+        <w:rPr>
+          <w:sz w:val="22"/>
+        </w:rPr>
+        <w:t>Méthodologie agile Scrum</w:t>
+      </w:r>
     </w:p>
     <w:p>
-      <w:pPr>
-        <w:pStyle w:val="Corpsdetexte"/>
-        <w:rPr>
-          <w:sz w:val="28"/>
-        </w:rPr>
-      </w:pPr>
+      <w:r>
+        <w:t>Si la méthode NAOMIE structure la démarche globale du projet (besoin, finalité, objectifs, méthodes, implémentation, évaluation), elle ne fixe pas la manière dont le développement est piloté au quotidien. Pour organiser la réalisation de manière itérative et incrémentale, nous avons adopté la méthodologie agile Scrum. Les deux approches sont complémentaires : NAOMIE encadre la cohérence d'ensemble, Scrum guide la production effective.</w:t>
+      </w:r>
     </w:p>
     <w:p>
-      <w:pPr>
-        <w:pStyle w:val="Corpsdetexte"/>
-        <w:rPr>
-          <w:sz w:val="28"/>
-        </w:rPr>
-      </w:pPr>
+      <w:r>
+        <w:t>Scrum est une approche agile dans laquelle le développement est découpé en itérations courtes appelées sprints, chacune produisant un incrément fonctionnel du produit. À la fin de chaque sprint, le travail réalisé est revu, validé et ajusté avant d'engager le sprint suivant. Cette mécanique privilégie la livraison progressive de valeur, l'adaptation aux changements et l'amélioration continue. Dans le cadre de ce projet, Scrum nous a permis de structurer l'avancement en livrables intermédiaires, d'aligner régulièrement les choix techniques avec les besoins métier SEO et de répartir clairement les tâches au sein du trinôme.</w:t>
+      </w:r>
     </w:p>
     <w:p>
-      <w:pPr>
-        <w:pStyle w:val="Corpsdetexte"/>
-        <w:rPr>
-          <w:sz w:val="28"/>
-        </w:rPr>
-      </w:pPr>
+      <w:r>
+        <w:rPr>
+          <w:b/>
+        </w:rPr>
+        <w:t>Adaptation des rôles au contexte PFE</w:t>
+      </w:r>
     </w:p>
     <w:p>
-      <w:pPr>
-        <w:pStyle w:val="Corpsdetexte"/>
-        <w:rPr>
-          <w:sz w:val="28"/>
-        </w:rPr>
-      </w:pPr>
+      <w:r>
+        <w:t>Le projet ayant été réalisé en trinôme dans un cadre académique, les rôles Scrum ont été adaptés au contexte du PFE. Les tâches ont été réparties au sein de l'équipe selon les points forts de chacun, en couvrant la chaîne complète : collecte et orchestration de données, logique métier et calcul des indicateurs, interface utilisateur et intégration de l'intelligence artificielle.</w:t>
+      </w:r>
+    </w:p>
+    <w:tbl>
+      <w:tblPr>
+        <w:tblW w:w="0" w:type="auto"/>
+        <w:jc w:val="center"/>
+        <w:tblLook w:val="04A0" w:firstRow="1" w:lastRow="0" w:firstColumn="1" w:lastColumn="0" w:noHBand="0" w:noVBand="1"/>
+      </w:tblPr>
+      <w:tblGrid>
+        <w:gridCol w:w="5169"/>
+        <w:gridCol w:w="5169"/>
+      </w:tblGrid>
+      <w:tr>
+        <w:trPr>
+          <w:jc w:val="center"/>
+        </w:trPr>
+        <w:tc>
+          <w:tcPr>
+            <w:tcW w:w="5169" w:type="dxa"/>
+            <w:tcBorders>
+              <w:top w:val="single" w:sz="4" w:space="0" w:color="000000"/>
+              <w:left w:val="single" w:sz="4" w:space="0" w:color="000000"/>
+              <w:bottom w:val="single" w:sz="4" w:space="0" w:color="000000"/>
+              <w:right w:val="single" w:sz="4" w:space="0" w:color="000000"/>
+            </w:tcBorders>
+            <w:shd w:val="clear" w:color="auto" w:fill="4472C4"/>
+          </w:tcPr>
+          <w:p>
+            <w:r>
+              <w:rPr>
+                <w:b/>
+                <w:color w:val="FFFFFF"/>
+                <w:sz w:val="20"/>
+              </w:rPr>
+              <w:t>Rôle</w:t>
+            </w:r>
+          </w:p>
+        </w:tc>
+        <w:tc>
+          <w:tcPr>
+            <w:tcW w:w="5169" w:type="dxa"/>
+            <w:tcBorders>
+              <w:top w:val="single" w:sz="4" w:space="0" w:color="000000"/>
+              <w:left w:val="single" w:sz="4" w:space="0" w:color="000000"/>
+              <w:bottom w:val="single" w:sz="4" w:space="0" w:color="000000"/>
+              <w:right w:val="single" w:sz="4" w:space="0" w:color="000000"/>
+            </w:tcBorders>
+            <w:shd w:val="clear" w:color="auto" w:fill="4472C4"/>
+          </w:tcPr>
+          <w:p>
+            <w:r>
+              <w:rPr>
+                <w:b/>
+                <w:color w:val="FFFFFF"/>
+                <w:sz w:val="20"/>
+              </w:rPr>
+              <w:t>Description</w:t>
+            </w:r>
+          </w:p>
+        </w:tc>
+      </w:tr>
+      <w:tr>
+        <w:trPr>
+          <w:jc w:val="center"/>
+        </w:trPr>
+        <w:tc>
+          <w:tcPr>
+            <w:tcW w:w="5169" w:type="dxa"/>
+            <w:tcBorders>
+              <w:top w:val="single" w:sz="4" w:space="0" w:color="000000"/>
+              <w:left w:val="single" w:sz="4" w:space="0" w:color="000000"/>
+              <w:bottom w:val="single" w:sz="4" w:space="0" w:color="000000"/>
+              <w:right w:val="single" w:sz="4" w:space="0" w:color="000000"/>
+            </w:tcBorders>
+            <w:shd w:val="clear" w:color="auto" w:fill="D9E1F2"/>
+          </w:tcPr>
+          <w:p>
+            <w:r>
+              <w:rPr>
+                <w:b/>
+                <w:sz w:val="20"/>
+              </w:rPr>
+              <w:t>Product Owner</w:t>
+            </w:r>
+          </w:p>
+        </w:tc>
+        <w:tc>
+          <w:tcPr>
+            <w:tcW w:w="5169" w:type="dxa"/>
+            <w:tcBorders>
+              <w:top w:val="single" w:sz="4" w:space="0" w:color="000000"/>
+              <w:left w:val="single" w:sz="4" w:space="0" w:color="000000"/>
+              <w:bottom w:val="single" w:sz="4" w:space="0" w:color="000000"/>
+              <w:right w:val="single" w:sz="4" w:space="0" w:color="000000"/>
+            </w:tcBorders>
+          </w:tcPr>
+          <w:p>
+            <w:r>
+              <w:rPr>
+                <w:sz w:val="20"/>
+              </w:rPr>
+              <w:t>Représenté par l'encadrant entreprise (WAOO Digital), porteur du besoin métier SEO. Il valide les fonctionnalités, priorise le backlog et garantit la conformité de la solution avec les attentes opérationnelles d'une agence SEO.</w:t>
+            </w:r>
+          </w:p>
+        </w:tc>
+      </w:tr>
+      <w:tr>
+        <w:trPr>
+          <w:jc w:val="center"/>
+        </w:trPr>
+        <w:tc>
+          <w:tcPr>
+            <w:tcW w:w="5169" w:type="dxa"/>
+            <w:tcBorders>
+              <w:top w:val="single" w:sz="4" w:space="0" w:color="000000"/>
+              <w:left w:val="single" w:sz="4" w:space="0" w:color="000000"/>
+              <w:bottom w:val="single" w:sz="4" w:space="0" w:color="000000"/>
+              <w:right w:val="single" w:sz="4" w:space="0" w:color="000000"/>
+            </w:tcBorders>
+            <w:shd w:val="clear" w:color="auto" w:fill="D9E1F2"/>
+          </w:tcPr>
+          <w:p>
+            <w:r>
+              <w:rPr>
+                <w:b/>
+                <w:sz w:val="20"/>
+              </w:rPr>
+              <w:t>Scrum Master</w:t>
+            </w:r>
+          </w:p>
+        </w:tc>
+        <w:tc>
+          <w:tcPr>
+            <w:tcW w:w="5169" w:type="dxa"/>
+            <w:tcBorders>
+              <w:top w:val="single" w:sz="4" w:space="0" w:color="000000"/>
+              <w:left w:val="single" w:sz="4" w:space="0" w:color="000000"/>
+              <w:bottom w:val="single" w:sz="4" w:space="0" w:color="000000"/>
+              <w:right w:val="single" w:sz="4" w:space="0" w:color="000000"/>
+            </w:tcBorders>
+            <w:shd w:val="clear" w:color="auto" w:fill="F2F2F2"/>
+          </w:tcPr>
+          <w:p>
+            <w:r>
+              <w:rPr>
+                <w:sz w:val="20"/>
+              </w:rPr>
+              <w:t>Rôle assuré de manière partagée au sein du trinôme, en concertation avec l'encadrant pédagogique. Il porte l'organisation du travail, le suivi de l'avancement, la planification des sprints et la levée des obstacles techniques ou méthodologiques.</w:t>
+            </w:r>
+          </w:p>
+        </w:tc>
+      </w:tr>
+      <w:tr>
+        <w:trPr>
+          <w:jc w:val="center"/>
+        </w:trPr>
+        <w:tc>
+          <w:tcPr>
+            <w:tcW w:w="5169" w:type="dxa"/>
+            <w:tcBorders>
+              <w:top w:val="single" w:sz="4" w:space="0" w:color="000000"/>
+              <w:left w:val="single" w:sz="4" w:space="0" w:color="000000"/>
+              <w:bottom w:val="single" w:sz="4" w:space="0" w:color="000000"/>
+              <w:right w:val="single" w:sz="4" w:space="0" w:color="000000"/>
+            </w:tcBorders>
+            <w:shd w:val="clear" w:color="auto" w:fill="D9E1F2"/>
+          </w:tcPr>
+          <w:p>
+            <w:r>
+              <w:rPr>
+                <w:b/>
+                <w:sz w:val="20"/>
+              </w:rPr>
+              <w:t>Équipe de développement</w:t>
+            </w:r>
+          </w:p>
+        </w:tc>
+        <w:tc>
+          <w:tcPr>
+            <w:tcW w:w="5169" w:type="dxa"/>
+            <w:tcBorders>
+              <w:top w:val="single" w:sz="4" w:space="0" w:color="000000"/>
+              <w:left w:val="single" w:sz="4" w:space="0" w:color="000000"/>
+              <w:bottom w:val="single" w:sz="4" w:space="0" w:color="000000"/>
+              <w:right w:val="single" w:sz="4" w:space="0" w:color="000000"/>
+            </w:tcBorders>
+          </w:tcPr>
+          <w:p>
+            <w:r>
+              <w:rPr>
+                <w:sz w:val="20"/>
+              </w:rPr>
+              <w:t>Composée des trois étudiants du trinôme. L'équipe couvre la conception, le développement, l'intégration, les tests et la documentation. Les responsabilités ont été réparties selon les points forts de chacun, tout en pratiquant une revue mutuelle des contributions.</w:t>
+            </w:r>
+          </w:p>
+        </w:tc>
+      </w:tr>
+    </w:tbl>
+    <w:p/>
+    <w:p>
+      <w:r>
+        <w:rPr>
+          <w:b/>
+        </w:rPr>
+        <w:t>Product Backlog</w:t>
+      </w:r>
     </w:p>
     <w:p>
-      <w:pPr>
-        <w:pStyle w:val="Corpsdetexte"/>
-        <w:rPr>
-          <w:sz w:val="28"/>
-        </w:rPr>
-      </w:pPr>
+      <w:r>
+        <w:t>Le Product Backlog regroupe l'ensemble des fonctionnalités et travaux à réaliser, priorisés en fonction de leur importance métier et de leur dépendance technique. Il a été établi en début de projet puis affiné au fil des sprints, en suivant l'évolution des besoins exprimés par le Product Owner.</w:t>
+      </w:r>
+    </w:p>
+    <w:tbl>
+      <w:tblPr>
+        <w:tblW w:w="0" w:type="auto"/>
+        <w:jc w:val="center"/>
+        <w:tblLook w:val="04A0" w:firstRow="1" w:lastRow="0" w:firstColumn="1" w:lastColumn="0" w:noHBand="0" w:noVBand="1"/>
+      </w:tblPr>
+      <w:tblGrid>
+        <w:gridCol w:w="2068"/>
+        <w:gridCol w:w="2068"/>
+        <w:gridCol w:w="2068"/>
+        <w:gridCol w:w="2068"/>
+        <w:gridCol w:w="2068"/>
+      </w:tblGrid>
+      <w:tr>
+        <w:trPr>
+          <w:jc w:val="center"/>
+        </w:trPr>
+        <w:tc>
+          <w:tcPr>
+            <w:tcW w:w="2068" w:type="dxa"/>
+            <w:tcBorders>
+              <w:top w:val="single" w:sz="4" w:space="0" w:color="000000"/>
+              <w:left w:val="single" w:sz="4" w:space="0" w:color="000000"/>
+              <w:bottom w:val="single" w:sz="4" w:space="0" w:color="000000"/>
+              <w:right w:val="single" w:sz="4" w:space="0" w:color="000000"/>
+            </w:tcBorders>
+            <w:shd w:val="clear" w:color="auto" w:fill="4472C4"/>
+          </w:tcPr>
+          <w:p>
+            <w:r>
+              <w:rPr>
+                <w:b/>
+                <w:color w:val="FFFFFF"/>
+                <w:sz w:val="20"/>
+              </w:rPr>
+              <w:t>ID</w:t>
+            </w:r>
+          </w:p>
+        </w:tc>
+        <w:tc>
+          <w:tcPr>
+            <w:tcW w:w="2068" w:type="dxa"/>
+            <w:tcBorders>
+              <w:top w:val="single" w:sz="4" w:space="0" w:color="000000"/>
+              <w:left w:val="single" w:sz="4" w:space="0" w:color="000000"/>
+              <w:bottom w:val="single" w:sz="4" w:space="0" w:color="000000"/>
+              <w:right w:val="single" w:sz="4" w:space="0" w:color="000000"/>
+            </w:tcBorders>
+            <w:shd w:val="clear" w:color="auto" w:fill="4472C4"/>
+          </w:tcPr>
+          <w:p>
+            <w:r>
+              <w:rPr>
+                <w:b/>
+                <w:color w:val="FFFFFF"/>
+                <w:sz w:val="20"/>
+              </w:rPr>
+              <w:t>User Story</w:t>
+            </w:r>
+          </w:p>
+        </w:tc>
+        <w:tc>
+          <w:tcPr>
+            <w:tcW w:w="2068" w:type="dxa"/>
+            <w:tcBorders>
+              <w:top w:val="single" w:sz="4" w:space="0" w:color="000000"/>
+              <w:left w:val="single" w:sz="4" w:space="0" w:color="000000"/>
+              <w:bottom w:val="single" w:sz="4" w:space="0" w:color="000000"/>
+              <w:right w:val="single" w:sz="4" w:space="0" w:color="000000"/>
+            </w:tcBorders>
+            <w:shd w:val="clear" w:color="auto" w:fill="4472C4"/>
+          </w:tcPr>
+          <w:p>
+            <w:r>
+              <w:rPr>
+                <w:b/>
+                <w:color w:val="FFFFFF"/>
+                <w:sz w:val="20"/>
+              </w:rPr>
+              <w:t>Priorité</w:t>
+            </w:r>
+          </w:p>
+        </w:tc>
+        <w:tc>
+          <w:tcPr>
+            <w:tcW w:w="2068" w:type="dxa"/>
+            <w:tcBorders>
+              <w:top w:val="single" w:sz="4" w:space="0" w:color="000000"/>
+              <w:left w:val="single" w:sz="4" w:space="0" w:color="000000"/>
+              <w:bottom w:val="single" w:sz="4" w:space="0" w:color="000000"/>
+              <w:right w:val="single" w:sz="4" w:space="0" w:color="000000"/>
+            </w:tcBorders>
+            <w:shd w:val="clear" w:color="auto" w:fill="4472C4"/>
+          </w:tcPr>
+          <w:p>
+            <w:r>
+              <w:rPr>
+                <w:b/>
+                <w:color w:val="FFFFFF"/>
+                <w:sz w:val="20"/>
+              </w:rPr>
+              <w:t>Statut</w:t>
+            </w:r>
+          </w:p>
+        </w:tc>
+        <w:tc>
+          <w:tcPr>
+            <w:tcW w:w="2068" w:type="dxa"/>
+            <w:tcBorders>
+              <w:top w:val="single" w:sz="4" w:space="0" w:color="000000"/>
+              <w:left w:val="single" w:sz="4" w:space="0" w:color="000000"/>
+              <w:bottom w:val="single" w:sz="4" w:space="0" w:color="000000"/>
+              <w:right w:val="single" w:sz="4" w:space="0" w:color="000000"/>
+            </w:tcBorders>
+            <w:shd w:val="clear" w:color="auto" w:fill="4472C4"/>
+          </w:tcPr>
+          <w:p>
+            <w:r>
+              <w:rPr>
+                <w:b/>
+                <w:color w:val="FFFFFF"/>
+                <w:sz w:val="20"/>
+              </w:rPr>
+              <w:t>Module</w:t>
+            </w:r>
+          </w:p>
+        </w:tc>
+      </w:tr>
+      <w:tr>
+        <w:trPr>
+          <w:jc w:val="center"/>
+        </w:trPr>
+        <w:tc>
+          <w:tcPr>
+            <w:tcW w:w="2068" w:type="dxa"/>
+            <w:tcBorders>
+              <w:top w:val="single" w:sz="4" w:space="0" w:color="000000"/>
+              <w:left w:val="single" w:sz="4" w:space="0" w:color="000000"/>
+              <w:bottom w:val="single" w:sz="4" w:space="0" w:color="000000"/>
+              <w:right w:val="single" w:sz="4" w:space="0" w:color="000000"/>
+            </w:tcBorders>
+          </w:tcPr>
+          <w:p>
+            <w:r>
+              <w:rPr>
+                <w:b/>
+                <w:sz w:val="18"/>
+              </w:rPr>
+              <w:t>US-01</w:t>
+            </w:r>
+          </w:p>
+        </w:tc>
+        <w:tc>
+          <w:tcPr>
+            <w:tcW w:w="2068" w:type="dxa"/>
+            <w:tcBorders>
+              <w:top w:val="single" w:sz="4" w:space="0" w:color="000000"/>
+              <w:left w:val="single" w:sz="4" w:space="0" w:color="000000"/>
+              <w:bottom w:val="single" w:sz="4" w:space="0" w:color="000000"/>
+              <w:right w:val="single" w:sz="4" w:space="0" w:color="000000"/>
+            </w:tcBorders>
+          </w:tcPr>
+          <w:p>
+            <w:r>
+              <w:rPr>
+                <w:sz w:val="18"/>
+              </w:rPr>
+              <w:t>En tant qu'utilisateur, je veux m'authentifier et réinitialiser mon mot de passe pour accéder à l'application en toute sécurité.</w:t>
+            </w:r>
+          </w:p>
+        </w:tc>
+        <w:tc>
+          <w:tcPr>
+            <w:tcW w:w="2068" w:type="dxa"/>
+            <w:tcBorders>
+              <w:top w:val="single" w:sz="4" w:space="0" w:color="000000"/>
+              <w:left w:val="single" w:sz="4" w:space="0" w:color="000000"/>
+              <w:bottom w:val="single" w:sz="4" w:space="0" w:color="000000"/>
+              <w:right w:val="single" w:sz="4" w:space="0" w:color="000000"/>
+            </w:tcBorders>
+          </w:tcPr>
+          <w:p>
+            <w:r>
+              <w:rPr>
+                <w:sz w:val="18"/>
+              </w:rPr>
+              <w:t>Haute</w:t>
+            </w:r>
+          </w:p>
+        </w:tc>
+        <w:tc>
+          <w:tcPr>
+            <w:tcW w:w="2068" w:type="dxa"/>
+            <w:tcBorders>
+              <w:top w:val="single" w:sz="4" w:space="0" w:color="000000"/>
+              <w:left w:val="single" w:sz="4" w:space="0" w:color="000000"/>
+              <w:bottom w:val="single" w:sz="4" w:space="0" w:color="000000"/>
+              <w:right w:val="single" w:sz="4" w:space="0" w:color="000000"/>
+            </w:tcBorders>
+          </w:tcPr>
+          <w:p>
+            <w:r>
+              <w:rPr>
+                <w:sz w:val="18"/>
+              </w:rPr>
+              <w:t>Terminé</w:t>
+            </w:r>
+          </w:p>
+        </w:tc>
+        <w:tc>
+          <w:tcPr>
+            <w:tcW w:w="2068" w:type="dxa"/>
+            <w:tcBorders>
+              <w:top w:val="single" w:sz="4" w:space="0" w:color="000000"/>
+              <w:left w:val="single" w:sz="4" w:space="0" w:color="000000"/>
+              <w:bottom w:val="single" w:sz="4" w:space="0" w:color="000000"/>
+              <w:right w:val="single" w:sz="4" w:space="0" w:color="000000"/>
+            </w:tcBorders>
+          </w:tcPr>
+          <w:p>
+            <w:r>
+              <w:rPr>
+                <w:sz w:val="18"/>
+              </w:rPr>
+              <w:t>Authentification</w:t>
+            </w:r>
+          </w:p>
+        </w:tc>
+      </w:tr>
+      <w:tr>
+        <w:trPr>
+          <w:jc w:val="center"/>
+        </w:trPr>
+        <w:tc>
+          <w:tcPr>
+            <w:tcW w:w="2068" w:type="dxa"/>
+            <w:tcBorders>
+              <w:top w:val="single" w:sz="4" w:space="0" w:color="000000"/>
+              <w:left w:val="single" w:sz="4" w:space="0" w:color="000000"/>
+              <w:bottom w:val="single" w:sz="4" w:space="0" w:color="000000"/>
+              <w:right w:val="single" w:sz="4" w:space="0" w:color="000000"/>
+            </w:tcBorders>
+            <w:shd w:val="clear" w:color="auto" w:fill="F2F2F2"/>
+          </w:tcPr>
+          <w:p>
+            <w:r>
+              <w:rPr>
+                <w:b/>
+                <w:sz w:val="18"/>
+              </w:rPr>
+              <w:t>US-02</w:t>
+            </w:r>
+          </w:p>
+        </w:tc>
+        <w:tc>
+          <w:tcPr>
+            <w:tcW w:w="2068" w:type="dxa"/>
+            <w:tcBorders>
+              <w:top w:val="single" w:sz="4" w:space="0" w:color="000000"/>
+              <w:left w:val="single" w:sz="4" w:space="0" w:color="000000"/>
+              <w:bottom w:val="single" w:sz="4" w:space="0" w:color="000000"/>
+              <w:right w:val="single" w:sz="4" w:space="0" w:color="000000"/>
+            </w:tcBorders>
+            <w:shd w:val="clear" w:color="auto" w:fill="F2F2F2"/>
+          </w:tcPr>
+          <w:p>
+            <w:r>
+              <w:rPr>
+                <w:sz w:val="18"/>
+              </w:rPr>
+              <w:t>En tant qu'utilisateur, je veux gérer mes projets SEO (création, édition, suppression, mots-clés de marque).</w:t>
+            </w:r>
+          </w:p>
+        </w:tc>
+        <w:tc>
+          <w:tcPr>
+            <w:tcW w:w="2068" w:type="dxa"/>
+            <w:tcBorders>
+              <w:top w:val="single" w:sz="4" w:space="0" w:color="000000"/>
+              <w:left w:val="single" w:sz="4" w:space="0" w:color="000000"/>
+              <w:bottom w:val="single" w:sz="4" w:space="0" w:color="000000"/>
+              <w:right w:val="single" w:sz="4" w:space="0" w:color="000000"/>
+            </w:tcBorders>
+            <w:shd w:val="clear" w:color="auto" w:fill="F2F2F2"/>
+          </w:tcPr>
+          <w:p>
+            <w:r>
+              <w:rPr>
+                <w:sz w:val="18"/>
+              </w:rPr>
+              <w:t>Haute</w:t>
+            </w:r>
+          </w:p>
+        </w:tc>
+        <w:tc>
+          <w:tcPr>
+            <w:tcW w:w="2068" w:type="dxa"/>
+            <w:tcBorders>
+              <w:top w:val="single" w:sz="4" w:space="0" w:color="000000"/>
+              <w:left w:val="single" w:sz="4" w:space="0" w:color="000000"/>
+              <w:bottom w:val="single" w:sz="4" w:space="0" w:color="000000"/>
+              <w:right w:val="single" w:sz="4" w:space="0" w:color="000000"/>
+            </w:tcBorders>
+            <w:shd w:val="clear" w:color="auto" w:fill="F2F2F2"/>
+          </w:tcPr>
+          <w:p>
+            <w:r>
+              <w:rPr>
+                <w:sz w:val="18"/>
+              </w:rPr>
+              <w:t>Terminé</w:t>
+            </w:r>
+          </w:p>
+        </w:tc>
+        <w:tc>
+          <w:tcPr>
+            <w:tcW w:w="2068" w:type="dxa"/>
+            <w:tcBorders>
+              <w:top w:val="single" w:sz="4" w:space="0" w:color="000000"/>
+              <w:left w:val="single" w:sz="4" w:space="0" w:color="000000"/>
+              <w:bottom w:val="single" w:sz="4" w:space="0" w:color="000000"/>
+              <w:right w:val="single" w:sz="4" w:space="0" w:color="000000"/>
+            </w:tcBorders>
+            <w:shd w:val="clear" w:color="auto" w:fill="F2F2F2"/>
+          </w:tcPr>
+          <w:p>
+            <w:r>
+              <w:rPr>
+                <w:sz w:val="18"/>
+              </w:rPr>
+              <w:t>Projets</w:t>
+            </w:r>
+          </w:p>
+        </w:tc>
+      </w:tr>
+      <w:tr>
+        <w:trPr>
+          <w:jc w:val="center"/>
+        </w:trPr>
+        <w:tc>
+          <w:tcPr>
+            <w:tcW w:w="2068" w:type="dxa"/>
+            <w:tcBorders>
+              <w:top w:val="single" w:sz="4" w:space="0" w:color="000000"/>
+              <w:left w:val="single" w:sz="4" w:space="0" w:color="000000"/>
+              <w:bottom w:val="single" w:sz="4" w:space="0" w:color="000000"/>
+              <w:right w:val="single" w:sz="4" w:space="0" w:color="000000"/>
+            </w:tcBorders>
+          </w:tcPr>
+          <w:p>
+            <w:r>
+              <w:rPr>
+                <w:b/>
+                <w:sz w:val="18"/>
+              </w:rPr>
+              <w:t>US-03</w:t>
+            </w:r>
+          </w:p>
+        </w:tc>
+        <w:tc>
+          <w:tcPr>
+            <w:tcW w:w="2068" w:type="dxa"/>
+            <w:tcBorders>
+              <w:top w:val="single" w:sz="4" w:space="0" w:color="000000"/>
+              <w:left w:val="single" w:sz="4" w:space="0" w:color="000000"/>
+              <w:bottom w:val="single" w:sz="4" w:space="0" w:color="000000"/>
+              <w:right w:val="single" w:sz="4" w:space="0" w:color="000000"/>
+            </w:tcBorders>
+          </w:tcPr>
+          <w:p>
+            <w:r>
+              <w:rPr>
+                <w:sz w:val="18"/>
+              </w:rPr>
+              <w:t>En tant que système, je veux collecter automatiquement les données Google Search Console via n8n.</w:t>
+            </w:r>
+          </w:p>
+        </w:tc>
+        <w:tc>
+          <w:tcPr>
+            <w:tcW w:w="2068" w:type="dxa"/>
+            <w:tcBorders>
+              <w:top w:val="single" w:sz="4" w:space="0" w:color="000000"/>
+              <w:left w:val="single" w:sz="4" w:space="0" w:color="000000"/>
+              <w:bottom w:val="single" w:sz="4" w:space="0" w:color="000000"/>
+              <w:right w:val="single" w:sz="4" w:space="0" w:color="000000"/>
+            </w:tcBorders>
+          </w:tcPr>
+          <w:p>
+            <w:r>
+              <w:rPr>
+                <w:sz w:val="18"/>
+              </w:rPr>
+              <w:t>Haute</w:t>
+            </w:r>
+          </w:p>
+        </w:tc>
+        <w:tc>
+          <w:tcPr>
+            <w:tcW w:w="2068" w:type="dxa"/>
+            <w:tcBorders>
+              <w:top w:val="single" w:sz="4" w:space="0" w:color="000000"/>
+              <w:left w:val="single" w:sz="4" w:space="0" w:color="000000"/>
+              <w:bottom w:val="single" w:sz="4" w:space="0" w:color="000000"/>
+              <w:right w:val="single" w:sz="4" w:space="0" w:color="000000"/>
+            </w:tcBorders>
+          </w:tcPr>
+          <w:p>
+            <w:r>
+              <w:rPr>
+                <w:sz w:val="18"/>
+              </w:rPr>
+              <w:t>Terminé</w:t>
+            </w:r>
+          </w:p>
+        </w:tc>
+        <w:tc>
+          <w:tcPr>
+            <w:tcW w:w="2068" w:type="dxa"/>
+            <w:tcBorders>
+              <w:top w:val="single" w:sz="4" w:space="0" w:color="000000"/>
+              <w:left w:val="single" w:sz="4" w:space="0" w:color="000000"/>
+              <w:bottom w:val="single" w:sz="4" w:space="0" w:color="000000"/>
+              <w:right w:val="single" w:sz="4" w:space="0" w:color="000000"/>
+            </w:tcBorders>
+          </w:tcPr>
+          <w:p>
+            <w:r>
+              <w:rPr>
+                <w:sz w:val="18"/>
+              </w:rPr>
+              <w:t>ETL / n8n</w:t>
+            </w:r>
+          </w:p>
+        </w:tc>
+      </w:tr>
+      <w:tr>
+        <w:trPr>
+          <w:jc w:val="center"/>
+        </w:trPr>
+        <w:tc>
+          <w:tcPr>
+            <w:tcW w:w="2068" w:type="dxa"/>
+            <w:tcBorders>
+              <w:top w:val="single" w:sz="4" w:space="0" w:color="000000"/>
+              <w:left w:val="single" w:sz="4" w:space="0" w:color="000000"/>
+              <w:bottom w:val="single" w:sz="4" w:space="0" w:color="000000"/>
+              <w:right w:val="single" w:sz="4" w:space="0" w:color="000000"/>
+            </w:tcBorders>
+            <w:shd w:val="clear" w:color="auto" w:fill="F2F2F2"/>
+          </w:tcPr>
+          <w:p>
+            <w:r>
+              <w:rPr>
+                <w:b/>
+                <w:sz w:val="18"/>
+              </w:rPr>
+              <w:t>US-04</w:t>
+            </w:r>
+          </w:p>
+        </w:tc>
+        <w:tc>
+          <w:tcPr>
+            <w:tcW w:w="2068" w:type="dxa"/>
+            <w:tcBorders>
+              <w:top w:val="single" w:sz="4" w:space="0" w:color="000000"/>
+              <w:left w:val="single" w:sz="4" w:space="0" w:color="000000"/>
+              <w:bottom w:val="single" w:sz="4" w:space="0" w:color="000000"/>
+              <w:right w:val="single" w:sz="4" w:space="0" w:color="000000"/>
+            </w:tcBorders>
+            <w:shd w:val="clear" w:color="auto" w:fill="F2F2F2"/>
+          </w:tcPr>
+          <w:p>
+            <w:r>
+              <w:rPr>
+                <w:sz w:val="18"/>
+              </w:rPr>
+              <w:t xml:space="preserve">En tant que système, je </w:t>
+            </w:r>
+            <w:r>
+              <w:rPr>
+                <w:sz w:val="18"/>
+              </w:rPr>
+              <w:lastRenderedPageBreak/>
+              <w:t>veux collecter les données SERP (volume, concurrence, PAA, AI Overview, CPC) via n8n.</w:t>
+            </w:r>
+          </w:p>
+        </w:tc>
+        <w:tc>
+          <w:tcPr>
+            <w:tcW w:w="2068" w:type="dxa"/>
+            <w:tcBorders>
+              <w:top w:val="single" w:sz="4" w:space="0" w:color="000000"/>
+              <w:left w:val="single" w:sz="4" w:space="0" w:color="000000"/>
+              <w:bottom w:val="single" w:sz="4" w:space="0" w:color="000000"/>
+              <w:right w:val="single" w:sz="4" w:space="0" w:color="000000"/>
+            </w:tcBorders>
+            <w:shd w:val="clear" w:color="auto" w:fill="F2F2F2"/>
+          </w:tcPr>
+          <w:p>
+            <w:r>
+              <w:rPr>
+                <w:sz w:val="18"/>
+              </w:rPr>
+              <w:lastRenderedPageBreak/>
+              <w:t>Haute</w:t>
+            </w:r>
+          </w:p>
+        </w:tc>
+        <w:tc>
+          <w:tcPr>
+            <w:tcW w:w="2068" w:type="dxa"/>
+            <w:tcBorders>
+              <w:top w:val="single" w:sz="4" w:space="0" w:color="000000"/>
+              <w:left w:val="single" w:sz="4" w:space="0" w:color="000000"/>
+              <w:bottom w:val="single" w:sz="4" w:space="0" w:color="000000"/>
+              <w:right w:val="single" w:sz="4" w:space="0" w:color="000000"/>
+            </w:tcBorders>
+            <w:shd w:val="clear" w:color="auto" w:fill="F2F2F2"/>
+          </w:tcPr>
+          <w:p>
+            <w:r>
+              <w:rPr>
+                <w:sz w:val="18"/>
+              </w:rPr>
+              <w:t>Terminé</w:t>
+            </w:r>
+          </w:p>
+        </w:tc>
+        <w:tc>
+          <w:tcPr>
+            <w:tcW w:w="2068" w:type="dxa"/>
+            <w:tcBorders>
+              <w:top w:val="single" w:sz="4" w:space="0" w:color="000000"/>
+              <w:left w:val="single" w:sz="4" w:space="0" w:color="000000"/>
+              <w:bottom w:val="single" w:sz="4" w:space="0" w:color="000000"/>
+              <w:right w:val="single" w:sz="4" w:space="0" w:color="000000"/>
+            </w:tcBorders>
+            <w:shd w:val="clear" w:color="auto" w:fill="F2F2F2"/>
+          </w:tcPr>
+          <w:p>
+            <w:r>
+              <w:rPr>
+                <w:sz w:val="18"/>
+              </w:rPr>
+              <w:t>ETL / n8n</w:t>
+            </w:r>
+          </w:p>
+        </w:tc>
+      </w:tr>
+      <w:tr>
+        <w:trPr>
+          <w:jc w:val="center"/>
+        </w:trPr>
+        <w:tc>
+          <w:tcPr>
+            <w:tcW w:w="2068" w:type="dxa"/>
+            <w:tcBorders>
+              <w:top w:val="single" w:sz="4" w:space="0" w:color="000000"/>
+              <w:left w:val="single" w:sz="4" w:space="0" w:color="000000"/>
+              <w:bottom w:val="single" w:sz="4" w:space="0" w:color="000000"/>
+              <w:right w:val="single" w:sz="4" w:space="0" w:color="000000"/>
+            </w:tcBorders>
+          </w:tcPr>
+          <w:p>
+            <w:r>
+              <w:rPr>
+                <w:b/>
+                <w:sz w:val="18"/>
+              </w:rPr>
+              <w:t>US-05</w:t>
+            </w:r>
+          </w:p>
+        </w:tc>
+        <w:tc>
+          <w:tcPr>
+            <w:tcW w:w="2068" w:type="dxa"/>
+            <w:tcBorders>
+              <w:top w:val="single" w:sz="4" w:space="0" w:color="000000"/>
+              <w:left w:val="single" w:sz="4" w:space="0" w:color="000000"/>
+              <w:bottom w:val="single" w:sz="4" w:space="0" w:color="000000"/>
+              <w:right w:val="single" w:sz="4" w:space="0" w:color="000000"/>
+            </w:tcBorders>
+          </w:tcPr>
+          <w:p>
+            <w:r>
+              <w:rPr>
+                <w:sz w:val="18"/>
+              </w:rPr>
+              <w:t>En tant que système, je veux nettoyer, normaliser et stocker les données dans PostgreSQL (gsc_daily, serp_daily).</w:t>
+            </w:r>
+          </w:p>
+        </w:tc>
+        <w:tc>
+          <w:tcPr>
+            <w:tcW w:w="2068" w:type="dxa"/>
+            <w:tcBorders>
+              <w:top w:val="single" w:sz="4" w:space="0" w:color="000000"/>
+              <w:left w:val="single" w:sz="4" w:space="0" w:color="000000"/>
+              <w:bottom w:val="single" w:sz="4" w:space="0" w:color="000000"/>
+              <w:right w:val="single" w:sz="4" w:space="0" w:color="000000"/>
+            </w:tcBorders>
+          </w:tcPr>
+          <w:p>
+            <w:r>
+              <w:rPr>
+                <w:sz w:val="18"/>
+              </w:rPr>
+              <w:t>Haute</w:t>
+            </w:r>
+          </w:p>
+        </w:tc>
+        <w:tc>
+          <w:tcPr>
+            <w:tcW w:w="2068" w:type="dxa"/>
+            <w:tcBorders>
+              <w:top w:val="single" w:sz="4" w:space="0" w:color="000000"/>
+              <w:left w:val="single" w:sz="4" w:space="0" w:color="000000"/>
+              <w:bottom w:val="single" w:sz="4" w:space="0" w:color="000000"/>
+              <w:right w:val="single" w:sz="4" w:space="0" w:color="000000"/>
+            </w:tcBorders>
+          </w:tcPr>
+          <w:p>
+            <w:r>
+              <w:rPr>
+                <w:sz w:val="18"/>
+              </w:rPr>
+              <w:t>Terminé</w:t>
+            </w:r>
+          </w:p>
+        </w:tc>
+        <w:tc>
+          <w:tcPr>
+            <w:tcW w:w="2068" w:type="dxa"/>
+            <w:tcBorders>
+              <w:top w:val="single" w:sz="4" w:space="0" w:color="000000"/>
+              <w:left w:val="single" w:sz="4" w:space="0" w:color="000000"/>
+              <w:bottom w:val="single" w:sz="4" w:space="0" w:color="000000"/>
+              <w:right w:val="single" w:sz="4" w:space="0" w:color="000000"/>
+            </w:tcBorders>
+          </w:tcPr>
+          <w:p>
+            <w:r>
+              <w:rPr>
+                <w:sz w:val="18"/>
+              </w:rPr>
+              <w:t>Données</w:t>
+            </w:r>
+          </w:p>
+        </w:tc>
+      </w:tr>
+      <w:tr>
+        <w:trPr>
+          <w:jc w:val="center"/>
+        </w:trPr>
+        <w:tc>
+          <w:tcPr>
+            <w:tcW w:w="2068" w:type="dxa"/>
+            <w:tcBorders>
+              <w:top w:val="single" w:sz="4" w:space="0" w:color="000000"/>
+              <w:left w:val="single" w:sz="4" w:space="0" w:color="000000"/>
+              <w:bottom w:val="single" w:sz="4" w:space="0" w:color="000000"/>
+              <w:right w:val="single" w:sz="4" w:space="0" w:color="000000"/>
+            </w:tcBorders>
+            <w:shd w:val="clear" w:color="auto" w:fill="F2F2F2"/>
+          </w:tcPr>
+          <w:p>
+            <w:r>
+              <w:rPr>
+                <w:b/>
+                <w:sz w:val="18"/>
+              </w:rPr>
+              <w:t>US-06</w:t>
+            </w:r>
+          </w:p>
+        </w:tc>
+        <w:tc>
+          <w:tcPr>
+            <w:tcW w:w="2068" w:type="dxa"/>
+            <w:tcBorders>
+              <w:top w:val="single" w:sz="4" w:space="0" w:color="000000"/>
+              <w:left w:val="single" w:sz="4" w:space="0" w:color="000000"/>
+              <w:bottom w:val="single" w:sz="4" w:space="0" w:color="000000"/>
+              <w:right w:val="single" w:sz="4" w:space="0" w:color="000000"/>
+            </w:tcBorders>
+            <w:shd w:val="clear" w:color="auto" w:fill="F2F2F2"/>
+          </w:tcPr>
+          <w:p>
+            <w:r>
+              <w:rPr>
+                <w:sz w:val="18"/>
+              </w:rPr>
+              <w:t>En tant qu'analyste, je veux des indicateurs décisionnels calculés automatiquement (opportunity_score, quick_win, ctr_gap, performance_drift, priority_score, competition_score).</w:t>
+            </w:r>
+          </w:p>
+        </w:tc>
+        <w:tc>
+          <w:tcPr>
+            <w:tcW w:w="2068" w:type="dxa"/>
+            <w:tcBorders>
+              <w:top w:val="single" w:sz="4" w:space="0" w:color="000000"/>
+              <w:left w:val="single" w:sz="4" w:space="0" w:color="000000"/>
+              <w:bottom w:val="single" w:sz="4" w:space="0" w:color="000000"/>
+              <w:right w:val="single" w:sz="4" w:space="0" w:color="000000"/>
+            </w:tcBorders>
+            <w:shd w:val="clear" w:color="auto" w:fill="F2F2F2"/>
+          </w:tcPr>
+          <w:p>
+            <w:r>
+              <w:rPr>
+                <w:sz w:val="18"/>
+              </w:rPr>
+              <w:t>Haute</w:t>
+            </w:r>
+          </w:p>
+        </w:tc>
+        <w:tc>
+          <w:tcPr>
+            <w:tcW w:w="2068" w:type="dxa"/>
+            <w:tcBorders>
+              <w:top w:val="single" w:sz="4" w:space="0" w:color="000000"/>
+              <w:left w:val="single" w:sz="4" w:space="0" w:color="000000"/>
+              <w:bottom w:val="single" w:sz="4" w:space="0" w:color="000000"/>
+              <w:right w:val="single" w:sz="4" w:space="0" w:color="000000"/>
+            </w:tcBorders>
+            <w:shd w:val="clear" w:color="auto" w:fill="F2F2F2"/>
+          </w:tcPr>
+          <w:p>
+            <w:r>
+              <w:rPr>
+                <w:sz w:val="18"/>
+              </w:rPr>
+              <w:t>Terminé</w:t>
+            </w:r>
+          </w:p>
+        </w:tc>
+        <w:tc>
+          <w:tcPr>
+            <w:tcW w:w="2068" w:type="dxa"/>
+            <w:tcBorders>
+              <w:top w:val="single" w:sz="4" w:space="0" w:color="000000"/>
+              <w:left w:val="single" w:sz="4" w:space="0" w:color="000000"/>
+              <w:bottom w:val="single" w:sz="4" w:space="0" w:color="000000"/>
+              <w:right w:val="single" w:sz="4" w:space="0" w:color="000000"/>
+            </w:tcBorders>
+            <w:shd w:val="clear" w:color="auto" w:fill="F2F2F2"/>
+          </w:tcPr>
+          <w:p>
+            <w:r>
+              <w:rPr>
+                <w:sz w:val="18"/>
+              </w:rPr>
+              <w:t>KPIs</w:t>
+            </w:r>
+          </w:p>
+        </w:tc>
+      </w:tr>
+      <w:tr>
+        <w:trPr>
+          <w:jc w:val="center"/>
+        </w:trPr>
+        <w:tc>
+          <w:tcPr>
+            <w:tcW w:w="2068" w:type="dxa"/>
+            <w:tcBorders>
+              <w:top w:val="single" w:sz="4" w:space="0" w:color="000000"/>
+              <w:left w:val="single" w:sz="4" w:space="0" w:color="000000"/>
+              <w:bottom w:val="single" w:sz="4" w:space="0" w:color="000000"/>
+              <w:right w:val="single" w:sz="4" w:space="0" w:color="000000"/>
+            </w:tcBorders>
+          </w:tcPr>
+          <w:p>
+            <w:r>
+              <w:rPr>
+                <w:b/>
+                <w:sz w:val="18"/>
+              </w:rPr>
+              <w:t>US-07</w:t>
+            </w:r>
+          </w:p>
+        </w:tc>
+        <w:tc>
+          <w:tcPr>
+            <w:tcW w:w="2068" w:type="dxa"/>
+            <w:tcBorders>
+              <w:top w:val="single" w:sz="4" w:space="0" w:color="000000"/>
+              <w:left w:val="single" w:sz="4" w:space="0" w:color="000000"/>
+              <w:bottom w:val="single" w:sz="4" w:space="0" w:color="000000"/>
+              <w:right w:val="single" w:sz="4" w:space="0" w:color="000000"/>
+            </w:tcBorders>
+          </w:tcPr>
+          <w:p>
+            <w:r>
+              <w:rPr>
+                <w:sz w:val="18"/>
+              </w:rPr>
+              <w:t>En tant que système, je veux qualifier localement les mots-clés (intention, marque, type de traîne) à partir de règles métier.</w:t>
+            </w:r>
+          </w:p>
+        </w:tc>
+        <w:tc>
+          <w:tcPr>
+            <w:tcW w:w="2068" w:type="dxa"/>
+            <w:tcBorders>
+              <w:top w:val="single" w:sz="4" w:space="0" w:color="000000"/>
+              <w:left w:val="single" w:sz="4" w:space="0" w:color="000000"/>
+              <w:bottom w:val="single" w:sz="4" w:space="0" w:color="000000"/>
+              <w:right w:val="single" w:sz="4" w:space="0" w:color="000000"/>
+            </w:tcBorders>
+          </w:tcPr>
+          <w:p>
+            <w:r>
+              <w:rPr>
+                <w:sz w:val="18"/>
+              </w:rPr>
+              <w:t>Haute</w:t>
+            </w:r>
+          </w:p>
+        </w:tc>
+        <w:tc>
+          <w:tcPr>
+            <w:tcW w:w="2068" w:type="dxa"/>
+            <w:tcBorders>
+              <w:top w:val="single" w:sz="4" w:space="0" w:color="000000"/>
+              <w:left w:val="single" w:sz="4" w:space="0" w:color="000000"/>
+              <w:bottom w:val="single" w:sz="4" w:space="0" w:color="000000"/>
+              <w:right w:val="single" w:sz="4" w:space="0" w:color="000000"/>
+            </w:tcBorders>
+          </w:tcPr>
+          <w:p>
+            <w:r>
+              <w:rPr>
+                <w:sz w:val="18"/>
+              </w:rPr>
+              <w:t>Terminé</w:t>
+            </w:r>
+          </w:p>
+        </w:tc>
+        <w:tc>
+          <w:tcPr>
+            <w:tcW w:w="2068" w:type="dxa"/>
+            <w:tcBorders>
+              <w:top w:val="single" w:sz="4" w:space="0" w:color="000000"/>
+              <w:left w:val="single" w:sz="4" w:space="0" w:color="000000"/>
+              <w:bottom w:val="single" w:sz="4" w:space="0" w:color="000000"/>
+              <w:right w:val="single" w:sz="4" w:space="0" w:color="000000"/>
+            </w:tcBorders>
+          </w:tcPr>
+          <w:p>
+            <w:r>
+              <w:rPr>
+                <w:sz w:val="18"/>
+              </w:rPr>
+              <w:t>NLP</w:t>
+            </w:r>
+          </w:p>
+        </w:tc>
+      </w:tr>
+      <w:tr>
+        <w:trPr>
+          <w:jc w:val="center"/>
+        </w:trPr>
+        <w:tc>
+          <w:tcPr>
+            <w:tcW w:w="2068" w:type="dxa"/>
+            <w:tcBorders>
+              <w:top w:val="single" w:sz="4" w:space="0" w:color="000000"/>
+              <w:left w:val="single" w:sz="4" w:space="0" w:color="000000"/>
+              <w:bottom w:val="single" w:sz="4" w:space="0" w:color="000000"/>
+              <w:right w:val="single" w:sz="4" w:space="0" w:color="000000"/>
+            </w:tcBorders>
+            <w:shd w:val="clear" w:color="auto" w:fill="F2F2F2"/>
+          </w:tcPr>
+          <w:p>
+            <w:r>
+              <w:rPr>
+                <w:b/>
+                <w:sz w:val="18"/>
+              </w:rPr>
+              <w:t>US-08</w:t>
+            </w:r>
+          </w:p>
+        </w:tc>
+        <w:tc>
+          <w:tcPr>
+            <w:tcW w:w="2068" w:type="dxa"/>
+            <w:tcBorders>
+              <w:top w:val="single" w:sz="4" w:space="0" w:color="000000"/>
+              <w:left w:val="single" w:sz="4" w:space="0" w:color="000000"/>
+              <w:bottom w:val="single" w:sz="4" w:space="0" w:color="000000"/>
+              <w:right w:val="single" w:sz="4" w:space="0" w:color="000000"/>
+            </w:tcBorders>
+            <w:shd w:val="clear" w:color="auto" w:fill="F2F2F2"/>
+          </w:tcPr>
+          <w:p>
+            <w:r>
+              <w:rPr>
+                <w:sz w:val="18"/>
+              </w:rPr>
+              <w:t>En tant que système, je veux enrichir les mots-clés à confiance faible via l'API Z.AI.</w:t>
+            </w:r>
+          </w:p>
+        </w:tc>
+        <w:tc>
+          <w:tcPr>
+            <w:tcW w:w="2068" w:type="dxa"/>
+            <w:tcBorders>
+              <w:top w:val="single" w:sz="4" w:space="0" w:color="000000"/>
+              <w:left w:val="single" w:sz="4" w:space="0" w:color="000000"/>
+              <w:bottom w:val="single" w:sz="4" w:space="0" w:color="000000"/>
+              <w:right w:val="single" w:sz="4" w:space="0" w:color="000000"/>
+            </w:tcBorders>
+            <w:shd w:val="clear" w:color="auto" w:fill="F2F2F2"/>
+          </w:tcPr>
+          <w:p>
+            <w:r>
+              <w:rPr>
+                <w:sz w:val="18"/>
+              </w:rPr>
+              <w:t>Haute</w:t>
+            </w:r>
+          </w:p>
+        </w:tc>
+        <w:tc>
+          <w:tcPr>
+            <w:tcW w:w="2068" w:type="dxa"/>
+            <w:tcBorders>
+              <w:top w:val="single" w:sz="4" w:space="0" w:color="000000"/>
+              <w:left w:val="single" w:sz="4" w:space="0" w:color="000000"/>
+              <w:bottom w:val="single" w:sz="4" w:space="0" w:color="000000"/>
+              <w:right w:val="single" w:sz="4" w:space="0" w:color="000000"/>
+            </w:tcBorders>
+            <w:shd w:val="clear" w:color="auto" w:fill="F2F2F2"/>
+          </w:tcPr>
+          <w:p>
+            <w:r>
+              <w:rPr>
+                <w:sz w:val="18"/>
+              </w:rPr>
+              <w:t>Terminé</w:t>
+            </w:r>
+          </w:p>
+        </w:tc>
+        <w:tc>
+          <w:tcPr>
+            <w:tcW w:w="2068" w:type="dxa"/>
+            <w:tcBorders>
+              <w:top w:val="single" w:sz="4" w:space="0" w:color="000000"/>
+              <w:left w:val="single" w:sz="4" w:space="0" w:color="000000"/>
+              <w:bottom w:val="single" w:sz="4" w:space="0" w:color="000000"/>
+              <w:right w:val="single" w:sz="4" w:space="0" w:color="000000"/>
+            </w:tcBorders>
+            <w:shd w:val="clear" w:color="auto" w:fill="F2F2F2"/>
+          </w:tcPr>
+          <w:p>
+            <w:r>
+              <w:rPr>
+                <w:sz w:val="18"/>
+              </w:rPr>
+              <w:t>IA</w:t>
+            </w:r>
+          </w:p>
+        </w:tc>
+      </w:tr>
+      <w:tr>
+        <w:trPr>
+          <w:jc w:val="center"/>
+        </w:trPr>
+        <w:tc>
+          <w:tcPr>
+            <w:tcW w:w="2068" w:type="dxa"/>
+            <w:tcBorders>
+              <w:top w:val="single" w:sz="4" w:space="0" w:color="000000"/>
+              <w:left w:val="single" w:sz="4" w:space="0" w:color="000000"/>
+              <w:bottom w:val="single" w:sz="4" w:space="0" w:color="000000"/>
+              <w:right w:val="single" w:sz="4" w:space="0" w:color="000000"/>
+            </w:tcBorders>
+          </w:tcPr>
+          <w:p>
+            <w:r>
+              <w:rPr>
+                <w:b/>
+                <w:sz w:val="18"/>
+              </w:rPr>
+              <w:t>US-09</w:t>
+            </w:r>
+          </w:p>
+        </w:tc>
+        <w:tc>
+          <w:tcPr>
+            <w:tcW w:w="2068" w:type="dxa"/>
+            <w:tcBorders>
+              <w:top w:val="single" w:sz="4" w:space="0" w:color="000000"/>
+              <w:left w:val="single" w:sz="4" w:space="0" w:color="000000"/>
+              <w:bottom w:val="single" w:sz="4" w:space="0" w:color="000000"/>
+              <w:right w:val="single" w:sz="4" w:space="0" w:color="000000"/>
+            </w:tcBorders>
+          </w:tcPr>
+          <w:p>
+            <w:r>
+              <w:rPr>
+                <w:sz w:val="18"/>
+              </w:rPr>
+              <w:t>En tant qu'analyste, je veux obtenir des clusters sémantiques de mots-clés par projet.</w:t>
+            </w:r>
+          </w:p>
+        </w:tc>
+        <w:tc>
+          <w:tcPr>
+            <w:tcW w:w="2068" w:type="dxa"/>
+            <w:tcBorders>
+              <w:top w:val="single" w:sz="4" w:space="0" w:color="000000"/>
+              <w:left w:val="single" w:sz="4" w:space="0" w:color="000000"/>
+              <w:bottom w:val="single" w:sz="4" w:space="0" w:color="000000"/>
+              <w:right w:val="single" w:sz="4" w:space="0" w:color="000000"/>
+            </w:tcBorders>
+          </w:tcPr>
+          <w:p>
+            <w:r>
+              <w:rPr>
+                <w:sz w:val="18"/>
+              </w:rPr>
+              <w:t>Moyenne</w:t>
+            </w:r>
+          </w:p>
+        </w:tc>
+        <w:tc>
+          <w:tcPr>
+            <w:tcW w:w="2068" w:type="dxa"/>
+            <w:tcBorders>
+              <w:top w:val="single" w:sz="4" w:space="0" w:color="000000"/>
+              <w:left w:val="single" w:sz="4" w:space="0" w:color="000000"/>
+              <w:bottom w:val="single" w:sz="4" w:space="0" w:color="000000"/>
+              <w:right w:val="single" w:sz="4" w:space="0" w:color="000000"/>
+            </w:tcBorders>
+          </w:tcPr>
+          <w:p>
+            <w:r>
+              <w:rPr>
+                <w:sz w:val="18"/>
+              </w:rPr>
+              <w:t>Terminé</w:t>
+            </w:r>
+          </w:p>
+        </w:tc>
+        <w:tc>
+          <w:tcPr>
+            <w:tcW w:w="2068" w:type="dxa"/>
+            <w:tcBorders>
+              <w:top w:val="single" w:sz="4" w:space="0" w:color="000000"/>
+              <w:left w:val="single" w:sz="4" w:space="0" w:color="000000"/>
+              <w:bottom w:val="single" w:sz="4" w:space="0" w:color="000000"/>
+              <w:right w:val="single" w:sz="4" w:space="0" w:color="000000"/>
+            </w:tcBorders>
+          </w:tcPr>
+          <w:p>
+            <w:r>
+              <w:rPr>
+                <w:sz w:val="18"/>
+              </w:rPr>
+              <w:t>IA</w:t>
+            </w:r>
+          </w:p>
+        </w:tc>
+      </w:tr>
+      <w:tr>
+        <w:trPr>
+          <w:jc w:val="center"/>
+        </w:trPr>
+        <w:tc>
+          <w:tcPr>
+            <w:tcW w:w="2068" w:type="dxa"/>
+            <w:tcBorders>
+              <w:top w:val="single" w:sz="4" w:space="0" w:color="000000"/>
+              <w:left w:val="single" w:sz="4" w:space="0" w:color="000000"/>
+              <w:bottom w:val="single" w:sz="4" w:space="0" w:color="000000"/>
+              <w:right w:val="single" w:sz="4" w:space="0" w:color="000000"/>
+            </w:tcBorders>
+            <w:shd w:val="clear" w:color="auto" w:fill="F2F2F2"/>
+          </w:tcPr>
+          <w:p>
+            <w:r>
+              <w:rPr>
+                <w:b/>
+                <w:sz w:val="18"/>
+              </w:rPr>
+              <w:t>US-10</w:t>
+            </w:r>
+          </w:p>
+        </w:tc>
+        <w:tc>
+          <w:tcPr>
+            <w:tcW w:w="2068" w:type="dxa"/>
+            <w:tcBorders>
+              <w:top w:val="single" w:sz="4" w:space="0" w:color="000000"/>
+              <w:left w:val="single" w:sz="4" w:space="0" w:color="000000"/>
+              <w:bottom w:val="single" w:sz="4" w:space="0" w:color="000000"/>
+              <w:right w:val="single" w:sz="4" w:space="0" w:color="000000"/>
+            </w:tcBorders>
+            <w:shd w:val="clear" w:color="auto" w:fill="F2F2F2"/>
+          </w:tcPr>
+          <w:p>
+            <w:r>
+              <w:rPr>
+                <w:sz w:val="18"/>
+              </w:rPr>
+              <w:t>En tant qu'analyste, je veux un plan d'action et une interprétation automatique du dashboard générés par l'IA.</w:t>
+            </w:r>
+          </w:p>
+        </w:tc>
+        <w:tc>
+          <w:tcPr>
+            <w:tcW w:w="2068" w:type="dxa"/>
+            <w:tcBorders>
+              <w:top w:val="single" w:sz="4" w:space="0" w:color="000000"/>
+              <w:left w:val="single" w:sz="4" w:space="0" w:color="000000"/>
+              <w:bottom w:val="single" w:sz="4" w:space="0" w:color="000000"/>
+              <w:right w:val="single" w:sz="4" w:space="0" w:color="000000"/>
+            </w:tcBorders>
+            <w:shd w:val="clear" w:color="auto" w:fill="F2F2F2"/>
+          </w:tcPr>
+          <w:p>
+            <w:r>
+              <w:rPr>
+                <w:sz w:val="18"/>
+              </w:rPr>
+              <w:t>Moyenne</w:t>
+            </w:r>
+          </w:p>
+        </w:tc>
+        <w:tc>
+          <w:tcPr>
+            <w:tcW w:w="2068" w:type="dxa"/>
+            <w:tcBorders>
+              <w:top w:val="single" w:sz="4" w:space="0" w:color="000000"/>
+              <w:left w:val="single" w:sz="4" w:space="0" w:color="000000"/>
+              <w:bottom w:val="single" w:sz="4" w:space="0" w:color="000000"/>
+              <w:right w:val="single" w:sz="4" w:space="0" w:color="000000"/>
+            </w:tcBorders>
+            <w:shd w:val="clear" w:color="auto" w:fill="F2F2F2"/>
+          </w:tcPr>
+          <w:p>
+            <w:r>
+              <w:rPr>
+                <w:sz w:val="18"/>
+              </w:rPr>
+              <w:t>Terminé</w:t>
+            </w:r>
+          </w:p>
+        </w:tc>
+        <w:tc>
+          <w:tcPr>
+            <w:tcW w:w="2068" w:type="dxa"/>
+            <w:tcBorders>
+              <w:top w:val="single" w:sz="4" w:space="0" w:color="000000"/>
+              <w:left w:val="single" w:sz="4" w:space="0" w:color="000000"/>
+              <w:bottom w:val="single" w:sz="4" w:space="0" w:color="000000"/>
+              <w:right w:val="single" w:sz="4" w:space="0" w:color="000000"/>
+            </w:tcBorders>
+            <w:shd w:val="clear" w:color="auto" w:fill="F2F2F2"/>
+          </w:tcPr>
+          <w:p>
+            <w:r>
+              <w:rPr>
+                <w:sz w:val="18"/>
+              </w:rPr>
+              <w:t>IA</w:t>
+            </w:r>
+          </w:p>
+        </w:tc>
+      </w:tr>
+      <w:tr>
+        <w:trPr>
+          <w:jc w:val="center"/>
+        </w:trPr>
+        <w:tc>
+          <w:tcPr>
+            <w:tcW w:w="2068" w:type="dxa"/>
+            <w:tcBorders>
+              <w:top w:val="single" w:sz="4" w:space="0" w:color="000000"/>
+              <w:left w:val="single" w:sz="4" w:space="0" w:color="000000"/>
+              <w:bottom w:val="single" w:sz="4" w:space="0" w:color="000000"/>
+              <w:right w:val="single" w:sz="4" w:space="0" w:color="000000"/>
+            </w:tcBorders>
+          </w:tcPr>
+          <w:p>
+            <w:r>
+              <w:rPr>
+                <w:b/>
+                <w:sz w:val="18"/>
+              </w:rPr>
+              <w:t>US-11</w:t>
+            </w:r>
+          </w:p>
+        </w:tc>
+        <w:tc>
+          <w:tcPr>
+            <w:tcW w:w="2068" w:type="dxa"/>
+            <w:tcBorders>
+              <w:top w:val="single" w:sz="4" w:space="0" w:color="000000"/>
+              <w:left w:val="single" w:sz="4" w:space="0" w:color="000000"/>
+              <w:bottom w:val="single" w:sz="4" w:space="0" w:color="000000"/>
+              <w:right w:val="single" w:sz="4" w:space="0" w:color="000000"/>
+            </w:tcBorders>
+          </w:tcPr>
+          <w:p>
+            <w:r>
+              <w:rPr>
+                <w:sz w:val="18"/>
+              </w:rPr>
+              <w:t>En tant qu'analyste, je veux un tableau de bord avec KPIs pondérés, courbes et alertes.</w:t>
+            </w:r>
+          </w:p>
+        </w:tc>
+        <w:tc>
+          <w:tcPr>
+            <w:tcW w:w="2068" w:type="dxa"/>
+            <w:tcBorders>
+              <w:top w:val="single" w:sz="4" w:space="0" w:color="000000"/>
+              <w:left w:val="single" w:sz="4" w:space="0" w:color="000000"/>
+              <w:bottom w:val="single" w:sz="4" w:space="0" w:color="000000"/>
+              <w:right w:val="single" w:sz="4" w:space="0" w:color="000000"/>
+            </w:tcBorders>
+          </w:tcPr>
+          <w:p>
+            <w:r>
+              <w:rPr>
+                <w:sz w:val="18"/>
+              </w:rPr>
+              <w:t>Haute</w:t>
+            </w:r>
+          </w:p>
+        </w:tc>
+        <w:tc>
+          <w:tcPr>
+            <w:tcW w:w="2068" w:type="dxa"/>
+            <w:tcBorders>
+              <w:top w:val="single" w:sz="4" w:space="0" w:color="000000"/>
+              <w:left w:val="single" w:sz="4" w:space="0" w:color="000000"/>
+              <w:bottom w:val="single" w:sz="4" w:space="0" w:color="000000"/>
+              <w:right w:val="single" w:sz="4" w:space="0" w:color="000000"/>
+            </w:tcBorders>
+          </w:tcPr>
+          <w:p>
+            <w:r>
+              <w:rPr>
+                <w:sz w:val="18"/>
+              </w:rPr>
+              <w:t>Terminé</w:t>
+            </w:r>
+          </w:p>
+        </w:tc>
+        <w:tc>
+          <w:tcPr>
+            <w:tcW w:w="2068" w:type="dxa"/>
+            <w:tcBorders>
+              <w:top w:val="single" w:sz="4" w:space="0" w:color="000000"/>
+              <w:left w:val="single" w:sz="4" w:space="0" w:color="000000"/>
+              <w:bottom w:val="single" w:sz="4" w:space="0" w:color="000000"/>
+              <w:right w:val="single" w:sz="4" w:space="0" w:color="000000"/>
+            </w:tcBorders>
+          </w:tcPr>
+          <w:p>
+            <w:r>
+              <w:rPr>
+                <w:sz w:val="18"/>
+              </w:rPr>
+              <w:t>Interface</w:t>
+            </w:r>
+          </w:p>
+        </w:tc>
+      </w:tr>
+      <w:tr>
+        <w:trPr>
+          <w:jc w:val="center"/>
+        </w:trPr>
+        <w:tc>
+          <w:tcPr>
+            <w:tcW w:w="2068" w:type="dxa"/>
+            <w:tcBorders>
+              <w:top w:val="single" w:sz="4" w:space="0" w:color="000000"/>
+              <w:left w:val="single" w:sz="4" w:space="0" w:color="000000"/>
+              <w:bottom w:val="single" w:sz="4" w:space="0" w:color="000000"/>
+              <w:right w:val="single" w:sz="4" w:space="0" w:color="000000"/>
+            </w:tcBorders>
+            <w:shd w:val="clear" w:color="auto" w:fill="F2F2F2"/>
+          </w:tcPr>
+          <w:p>
+            <w:r>
+              <w:rPr>
+                <w:b/>
+                <w:sz w:val="18"/>
+              </w:rPr>
+              <w:t>US-12</w:t>
+            </w:r>
+          </w:p>
+        </w:tc>
+        <w:tc>
+          <w:tcPr>
+            <w:tcW w:w="2068" w:type="dxa"/>
+            <w:tcBorders>
+              <w:top w:val="single" w:sz="4" w:space="0" w:color="000000"/>
+              <w:left w:val="single" w:sz="4" w:space="0" w:color="000000"/>
+              <w:bottom w:val="single" w:sz="4" w:space="0" w:color="000000"/>
+              <w:right w:val="single" w:sz="4" w:space="0" w:color="000000"/>
+            </w:tcBorders>
+            <w:shd w:val="clear" w:color="auto" w:fill="F2F2F2"/>
+          </w:tcPr>
+          <w:p>
+            <w:r>
+              <w:rPr>
+                <w:sz w:val="18"/>
+              </w:rPr>
+              <w:t>En tant qu'analyste, je veux une page Opportunités triée par opportunity_score avec visualisation Position × Score.</w:t>
+            </w:r>
+          </w:p>
+        </w:tc>
+        <w:tc>
+          <w:tcPr>
+            <w:tcW w:w="2068" w:type="dxa"/>
+            <w:tcBorders>
+              <w:top w:val="single" w:sz="4" w:space="0" w:color="000000"/>
+              <w:left w:val="single" w:sz="4" w:space="0" w:color="000000"/>
+              <w:bottom w:val="single" w:sz="4" w:space="0" w:color="000000"/>
+              <w:right w:val="single" w:sz="4" w:space="0" w:color="000000"/>
+            </w:tcBorders>
+            <w:shd w:val="clear" w:color="auto" w:fill="F2F2F2"/>
+          </w:tcPr>
+          <w:p>
+            <w:r>
+              <w:rPr>
+                <w:sz w:val="18"/>
+              </w:rPr>
+              <w:t>Haute</w:t>
+            </w:r>
+          </w:p>
+        </w:tc>
+        <w:tc>
+          <w:tcPr>
+            <w:tcW w:w="2068" w:type="dxa"/>
+            <w:tcBorders>
+              <w:top w:val="single" w:sz="4" w:space="0" w:color="000000"/>
+              <w:left w:val="single" w:sz="4" w:space="0" w:color="000000"/>
+              <w:bottom w:val="single" w:sz="4" w:space="0" w:color="000000"/>
+              <w:right w:val="single" w:sz="4" w:space="0" w:color="000000"/>
+            </w:tcBorders>
+            <w:shd w:val="clear" w:color="auto" w:fill="F2F2F2"/>
+          </w:tcPr>
+          <w:p>
+            <w:r>
+              <w:rPr>
+                <w:sz w:val="18"/>
+              </w:rPr>
+              <w:t>Terminé</w:t>
+            </w:r>
+          </w:p>
+        </w:tc>
+        <w:tc>
+          <w:tcPr>
+            <w:tcW w:w="2068" w:type="dxa"/>
+            <w:tcBorders>
+              <w:top w:val="single" w:sz="4" w:space="0" w:color="000000"/>
+              <w:left w:val="single" w:sz="4" w:space="0" w:color="000000"/>
+              <w:bottom w:val="single" w:sz="4" w:space="0" w:color="000000"/>
+              <w:right w:val="single" w:sz="4" w:space="0" w:color="000000"/>
+            </w:tcBorders>
+            <w:shd w:val="clear" w:color="auto" w:fill="F2F2F2"/>
+          </w:tcPr>
+          <w:p>
+            <w:r>
+              <w:rPr>
+                <w:sz w:val="18"/>
+              </w:rPr>
+              <w:t>Interface</w:t>
+            </w:r>
+          </w:p>
+        </w:tc>
+      </w:tr>
+      <w:tr>
+        <w:trPr>
+          <w:jc w:val="center"/>
+        </w:trPr>
+        <w:tc>
+          <w:tcPr>
+            <w:tcW w:w="2068" w:type="dxa"/>
+            <w:tcBorders>
+              <w:top w:val="single" w:sz="4" w:space="0" w:color="000000"/>
+              <w:left w:val="single" w:sz="4" w:space="0" w:color="000000"/>
+              <w:bottom w:val="single" w:sz="4" w:space="0" w:color="000000"/>
+              <w:right w:val="single" w:sz="4" w:space="0" w:color="000000"/>
+            </w:tcBorders>
+          </w:tcPr>
+          <w:p>
+            <w:r>
+              <w:rPr>
+                <w:b/>
+                <w:sz w:val="18"/>
+              </w:rPr>
+              <w:t>US-13</w:t>
+            </w:r>
+          </w:p>
+        </w:tc>
+        <w:tc>
+          <w:tcPr>
+            <w:tcW w:w="2068" w:type="dxa"/>
+            <w:tcBorders>
+              <w:top w:val="single" w:sz="4" w:space="0" w:color="000000"/>
+              <w:left w:val="single" w:sz="4" w:space="0" w:color="000000"/>
+              <w:bottom w:val="single" w:sz="4" w:space="0" w:color="000000"/>
+              <w:right w:val="single" w:sz="4" w:space="0" w:color="000000"/>
+            </w:tcBorders>
+          </w:tcPr>
+          <w:p>
+            <w:r>
+              <w:rPr>
+                <w:sz w:val="18"/>
+              </w:rPr>
+              <w:t>En tant qu'analyste, je veux suivre les mots-clés travaillés (is_tracked) et leur évolution de position.</w:t>
+            </w:r>
+          </w:p>
+        </w:tc>
+        <w:tc>
+          <w:tcPr>
+            <w:tcW w:w="2068" w:type="dxa"/>
+            <w:tcBorders>
+              <w:top w:val="single" w:sz="4" w:space="0" w:color="000000"/>
+              <w:left w:val="single" w:sz="4" w:space="0" w:color="000000"/>
+              <w:bottom w:val="single" w:sz="4" w:space="0" w:color="000000"/>
+              <w:right w:val="single" w:sz="4" w:space="0" w:color="000000"/>
+            </w:tcBorders>
+          </w:tcPr>
+          <w:p>
+            <w:r>
+              <w:rPr>
+                <w:sz w:val="18"/>
+              </w:rPr>
+              <w:t>Haute</w:t>
+            </w:r>
+          </w:p>
+        </w:tc>
+        <w:tc>
+          <w:tcPr>
+            <w:tcW w:w="2068" w:type="dxa"/>
+            <w:tcBorders>
+              <w:top w:val="single" w:sz="4" w:space="0" w:color="000000"/>
+              <w:left w:val="single" w:sz="4" w:space="0" w:color="000000"/>
+              <w:bottom w:val="single" w:sz="4" w:space="0" w:color="000000"/>
+              <w:right w:val="single" w:sz="4" w:space="0" w:color="000000"/>
+            </w:tcBorders>
+          </w:tcPr>
+          <w:p>
+            <w:r>
+              <w:rPr>
+                <w:sz w:val="18"/>
+              </w:rPr>
+              <w:t>Terminé</w:t>
+            </w:r>
+          </w:p>
+        </w:tc>
+        <w:tc>
+          <w:tcPr>
+            <w:tcW w:w="2068" w:type="dxa"/>
+            <w:tcBorders>
+              <w:top w:val="single" w:sz="4" w:space="0" w:color="000000"/>
+              <w:left w:val="single" w:sz="4" w:space="0" w:color="000000"/>
+              <w:bottom w:val="single" w:sz="4" w:space="0" w:color="000000"/>
+              <w:right w:val="single" w:sz="4" w:space="0" w:color="000000"/>
+            </w:tcBorders>
+          </w:tcPr>
+          <w:p>
+            <w:r>
+              <w:rPr>
+                <w:sz w:val="18"/>
+              </w:rPr>
+              <w:t>Interface</w:t>
+            </w:r>
+          </w:p>
+        </w:tc>
+      </w:tr>
+      <w:tr>
+        <w:trPr>
+          <w:jc w:val="center"/>
+        </w:trPr>
+        <w:tc>
+          <w:tcPr>
+            <w:tcW w:w="2068" w:type="dxa"/>
+            <w:tcBorders>
+              <w:top w:val="single" w:sz="4" w:space="0" w:color="000000"/>
+              <w:left w:val="single" w:sz="4" w:space="0" w:color="000000"/>
+              <w:bottom w:val="single" w:sz="4" w:space="0" w:color="000000"/>
+              <w:right w:val="single" w:sz="4" w:space="0" w:color="000000"/>
+            </w:tcBorders>
+            <w:shd w:val="clear" w:color="auto" w:fill="F2F2F2"/>
+          </w:tcPr>
+          <w:p>
+            <w:r>
+              <w:rPr>
+                <w:b/>
+                <w:sz w:val="18"/>
+              </w:rPr>
+              <w:t>US-14</w:t>
+            </w:r>
+          </w:p>
+        </w:tc>
+        <w:tc>
+          <w:tcPr>
+            <w:tcW w:w="2068" w:type="dxa"/>
+            <w:tcBorders>
+              <w:top w:val="single" w:sz="4" w:space="0" w:color="000000"/>
+              <w:left w:val="single" w:sz="4" w:space="0" w:color="000000"/>
+              <w:bottom w:val="single" w:sz="4" w:space="0" w:color="000000"/>
+              <w:right w:val="single" w:sz="4" w:space="0" w:color="000000"/>
+            </w:tcBorders>
+            <w:shd w:val="clear" w:color="auto" w:fill="F2F2F2"/>
+          </w:tcPr>
+          <w:p>
+            <w:r>
+              <w:rPr>
+                <w:sz w:val="18"/>
+              </w:rPr>
+              <w:t>En tant qu'analyste, je veux un assistant conversationnel saisonnier dans la page Calendrier.</w:t>
+            </w:r>
+          </w:p>
+        </w:tc>
+        <w:tc>
+          <w:tcPr>
+            <w:tcW w:w="2068" w:type="dxa"/>
+            <w:tcBorders>
+              <w:top w:val="single" w:sz="4" w:space="0" w:color="000000"/>
+              <w:left w:val="single" w:sz="4" w:space="0" w:color="000000"/>
+              <w:bottom w:val="single" w:sz="4" w:space="0" w:color="000000"/>
+              <w:right w:val="single" w:sz="4" w:space="0" w:color="000000"/>
+            </w:tcBorders>
+            <w:shd w:val="clear" w:color="auto" w:fill="F2F2F2"/>
+          </w:tcPr>
+          <w:p>
+            <w:r>
+              <w:rPr>
+                <w:sz w:val="18"/>
+              </w:rPr>
+              <w:t>Moyenne</w:t>
+            </w:r>
+          </w:p>
+        </w:tc>
+        <w:tc>
+          <w:tcPr>
+            <w:tcW w:w="2068" w:type="dxa"/>
+            <w:tcBorders>
+              <w:top w:val="single" w:sz="4" w:space="0" w:color="000000"/>
+              <w:left w:val="single" w:sz="4" w:space="0" w:color="000000"/>
+              <w:bottom w:val="single" w:sz="4" w:space="0" w:color="000000"/>
+              <w:right w:val="single" w:sz="4" w:space="0" w:color="000000"/>
+            </w:tcBorders>
+            <w:shd w:val="clear" w:color="auto" w:fill="F2F2F2"/>
+          </w:tcPr>
+          <w:p>
+            <w:r>
+              <w:rPr>
+                <w:sz w:val="18"/>
+              </w:rPr>
+              <w:t>Terminé</w:t>
+            </w:r>
+          </w:p>
+        </w:tc>
+        <w:tc>
+          <w:tcPr>
+            <w:tcW w:w="2068" w:type="dxa"/>
+            <w:tcBorders>
+              <w:top w:val="single" w:sz="4" w:space="0" w:color="000000"/>
+              <w:left w:val="single" w:sz="4" w:space="0" w:color="000000"/>
+              <w:bottom w:val="single" w:sz="4" w:space="0" w:color="000000"/>
+              <w:right w:val="single" w:sz="4" w:space="0" w:color="000000"/>
+            </w:tcBorders>
+            <w:shd w:val="clear" w:color="auto" w:fill="F2F2F2"/>
+          </w:tcPr>
+          <w:p>
+            <w:r>
+              <w:rPr>
+                <w:sz w:val="18"/>
+              </w:rPr>
+              <w:t>Interface / IA</w:t>
+            </w:r>
+          </w:p>
+        </w:tc>
+      </w:tr>
+      <w:tr>
+        <w:trPr>
+          <w:jc w:val="center"/>
+        </w:trPr>
+        <w:tc>
+          <w:tcPr>
+            <w:tcW w:w="2068" w:type="dxa"/>
+            <w:tcBorders>
+              <w:top w:val="single" w:sz="4" w:space="0" w:color="000000"/>
+              <w:left w:val="single" w:sz="4" w:space="0" w:color="000000"/>
+              <w:bottom w:val="single" w:sz="4" w:space="0" w:color="000000"/>
+              <w:right w:val="single" w:sz="4" w:space="0" w:color="000000"/>
+            </w:tcBorders>
+          </w:tcPr>
+          <w:p>
+            <w:r>
+              <w:rPr>
+                <w:b/>
+                <w:sz w:val="18"/>
+              </w:rPr>
+              <w:t>US-15</w:t>
+            </w:r>
+          </w:p>
+        </w:tc>
+        <w:tc>
+          <w:tcPr>
+            <w:tcW w:w="2068" w:type="dxa"/>
+            <w:tcBorders>
+              <w:top w:val="single" w:sz="4" w:space="0" w:color="000000"/>
+              <w:left w:val="single" w:sz="4" w:space="0" w:color="000000"/>
+              <w:bottom w:val="single" w:sz="4" w:space="0" w:color="000000"/>
+              <w:right w:val="single" w:sz="4" w:space="0" w:color="000000"/>
+            </w:tcBorders>
+          </w:tcPr>
+          <w:p>
+            <w:r>
+              <w:rPr>
+                <w:sz w:val="18"/>
+              </w:rPr>
+              <w:t>En tant qu'utilisateur, je veux gérer mes paramètres (mots-clés de marque, profil).</w:t>
+            </w:r>
+          </w:p>
+        </w:tc>
+        <w:tc>
+          <w:tcPr>
+            <w:tcW w:w="2068" w:type="dxa"/>
+            <w:tcBorders>
+              <w:top w:val="single" w:sz="4" w:space="0" w:color="000000"/>
+              <w:left w:val="single" w:sz="4" w:space="0" w:color="000000"/>
+              <w:bottom w:val="single" w:sz="4" w:space="0" w:color="000000"/>
+              <w:right w:val="single" w:sz="4" w:space="0" w:color="000000"/>
+            </w:tcBorders>
+          </w:tcPr>
+          <w:p>
+            <w:r>
+              <w:rPr>
+                <w:sz w:val="18"/>
+              </w:rPr>
+              <w:t>Moyenne</w:t>
+            </w:r>
+          </w:p>
+        </w:tc>
+        <w:tc>
+          <w:tcPr>
+            <w:tcW w:w="2068" w:type="dxa"/>
+            <w:tcBorders>
+              <w:top w:val="single" w:sz="4" w:space="0" w:color="000000"/>
+              <w:left w:val="single" w:sz="4" w:space="0" w:color="000000"/>
+              <w:bottom w:val="single" w:sz="4" w:space="0" w:color="000000"/>
+              <w:right w:val="single" w:sz="4" w:space="0" w:color="000000"/>
+            </w:tcBorders>
+          </w:tcPr>
+          <w:p>
+            <w:r>
+              <w:rPr>
+                <w:sz w:val="18"/>
+              </w:rPr>
+              <w:t>Terminé</w:t>
+            </w:r>
+          </w:p>
+        </w:tc>
+        <w:tc>
+          <w:tcPr>
+            <w:tcW w:w="2068" w:type="dxa"/>
+            <w:tcBorders>
+              <w:top w:val="single" w:sz="4" w:space="0" w:color="000000"/>
+              <w:left w:val="single" w:sz="4" w:space="0" w:color="000000"/>
+              <w:bottom w:val="single" w:sz="4" w:space="0" w:color="000000"/>
+              <w:right w:val="single" w:sz="4" w:space="0" w:color="000000"/>
+            </w:tcBorders>
+          </w:tcPr>
+          <w:p>
+            <w:r>
+              <w:rPr>
+                <w:sz w:val="18"/>
+              </w:rPr>
+              <w:t>Paramètres</w:t>
+            </w:r>
+          </w:p>
+        </w:tc>
+      </w:tr>
+      <w:tr>
+        <w:trPr>
+          <w:jc w:val="center"/>
+        </w:trPr>
+        <w:tc>
+          <w:tcPr>
+            <w:tcW w:w="2068" w:type="dxa"/>
+            <w:tcBorders>
+              <w:top w:val="single" w:sz="4" w:space="0" w:color="000000"/>
+              <w:left w:val="single" w:sz="4" w:space="0" w:color="000000"/>
+              <w:bottom w:val="single" w:sz="4" w:space="0" w:color="000000"/>
+              <w:right w:val="single" w:sz="4" w:space="0" w:color="000000"/>
+            </w:tcBorders>
+            <w:shd w:val="clear" w:color="auto" w:fill="F2F2F2"/>
+          </w:tcPr>
+          <w:p>
+            <w:r>
+              <w:rPr>
+                <w:b/>
+                <w:sz w:val="18"/>
+              </w:rPr>
+              <w:t>US-16</w:t>
+            </w:r>
+          </w:p>
+        </w:tc>
+        <w:tc>
+          <w:tcPr>
+            <w:tcW w:w="2068" w:type="dxa"/>
+            <w:tcBorders>
+              <w:top w:val="single" w:sz="4" w:space="0" w:color="000000"/>
+              <w:left w:val="single" w:sz="4" w:space="0" w:color="000000"/>
+              <w:bottom w:val="single" w:sz="4" w:space="0" w:color="000000"/>
+              <w:right w:val="single" w:sz="4" w:space="0" w:color="000000"/>
+            </w:tcBorders>
+            <w:shd w:val="clear" w:color="auto" w:fill="F2F2F2"/>
+          </w:tcPr>
+          <w:p>
+            <w:r>
+              <w:rPr>
+                <w:sz w:val="18"/>
+              </w:rPr>
+              <w:t>En tant qu'équipe projet, je veux valider la solution (tests, cohérence des données) et finaliser le rapport.</w:t>
+            </w:r>
+          </w:p>
+        </w:tc>
+        <w:tc>
+          <w:tcPr>
+            <w:tcW w:w="2068" w:type="dxa"/>
+            <w:tcBorders>
+              <w:top w:val="single" w:sz="4" w:space="0" w:color="000000"/>
+              <w:left w:val="single" w:sz="4" w:space="0" w:color="000000"/>
+              <w:bottom w:val="single" w:sz="4" w:space="0" w:color="000000"/>
+              <w:right w:val="single" w:sz="4" w:space="0" w:color="000000"/>
+            </w:tcBorders>
+            <w:shd w:val="clear" w:color="auto" w:fill="F2F2F2"/>
+          </w:tcPr>
+          <w:p>
+            <w:r>
+              <w:rPr>
+                <w:sz w:val="18"/>
+              </w:rPr>
+              <w:t>Haute</w:t>
+            </w:r>
+          </w:p>
+        </w:tc>
+        <w:tc>
+          <w:tcPr>
+            <w:tcW w:w="2068" w:type="dxa"/>
+            <w:tcBorders>
+              <w:top w:val="single" w:sz="4" w:space="0" w:color="000000"/>
+              <w:left w:val="single" w:sz="4" w:space="0" w:color="000000"/>
+              <w:bottom w:val="single" w:sz="4" w:space="0" w:color="000000"/>
+              <w:right w:val="single" w:sz="4" w:space="0" w:color="000000"/>
+            </w:tcBorders>
+            <w:shd w:val="clear" w:color="auto" w:fill="F2F2F2"/>
+          </w:tcPr>
+          <w:p>
+            <w:r>
+              <w:rPr>
+                <w:sz w:val="18"/>
+              </w:rPr>
+              <w:t>Terminé</w:t>
+            </w:r>
+          </w:p>
+        </w:tc>
+        <w:tc>
+          <w:tcPr>
+            <w:tcW w:w="2068" w:type="dxa"/>
+            <w:tcBorders>
+              <w:top w:val="single" w:sz="4" w:space="0" w:color="000000"/>
+              <w:left w:val="single" w:sz="4" w:space="0" w:color="000000"/>
+              <w:bottom w:val="single" w:sz="4" w:space="0" w:color="000000"/>
+              <w:right w:val="single" w:sz="4" w:space="0" w:color="000000"/>
+            </w:tcBorders>
+            <w:shd w:val="clear" w:color="auto" w:fill="F2F2F2"/>
+          </w:tcPr>
+          <w:p>
+            <w:r>
+              <w:rPr>
+                <w:sz w:val="18"/>
+              </w:rPr>
+              <w:t>Qualité</w:t>
+            </w:r>
+          </w:p>
+        </w:tc>
+      </w:tr>
+    </w:tbl>
+    <w:p/>
+    <w:p>
+      <w:r>
+        <w:rPr>
+          <w:b/>
+        </w:rPr>
+        <w:t>Découpage en sprints</w:t>
+      </w:r>
     </w:p>
     <w:p>
-      <w:pPr>
-        <w:pStyle w:val="Corpsdetexte"/>
-        <w:spacing w:before="152"/>
-        <w:rPr>
-          <w:sz w:val="28"/>
-        </w:rPr>
-      </w:pPr>
+      <w:r>
+        <w:t>Le développement de la plateforme a été découpé en sept sprints, chacun structuré autour d'un objectif fonctionnel ou technique précis. Chaque sprint a abouti à un incrément testé et intégré à l'application. Les sprints sont décrits ci-dessous sans dates absolues, conformément à l'usage académique.</w:t>
+      </w:r>
     </w:p>
+    <w:p>
+      <w:r>
+        <w:rPr>
+          <w:b/>
+        </w:rPr>
+        <w:lastRenderedPageBreak/>
+        <w:t>Sprint 1 — Cadrage et étude SEO</w:t>
+      </w:r>
+    </w:p>
+    <w:tbl>
+      <w:tblPr>
+        <w:tblW w:w="0" w:type="auto"/>
+        <w:jc w:val="center"/>
+        <w:tblLook w:val="04A0" w:firstRow="1" w:lastRow="0" w:firstColumn="1" w:lastColumn="0" w:noHBand="0" w:noVBand="1"/>
+      </w:tblPr>
+      <w:tblGrid>
+        <w:gridCol w:w="5169"/>
+        <w:gridCol w:w="5169"/>
+      </w:tblGrid>
+      <w:tr>
+        <w:trPr>
+          <w:jc w:val="center"/>
+        </w:trPr>
+        <w:tc>
+          <w:tcPr>
+            <w:tcW w:w="5169" w:type="dxa"/>
+            <w:tcBorders>
+              <w:top w:val="single" w:sz="4" w:space="0" w:color="000000"/>
+              <w:left w:val="single" w:sz="4" w:space="0" w:color="000000"/>
+              <w:bottom w:val="single" w:sz="4" w:space="0" w:color="000000"/>
+              <w:right w:val="single" w:sz="4" w:space="0" w:color="000000"/>
+            </w:tcBorders>
+            <w:shd w:val="clear" w:color="auto" w:fill="D9E1F2"/>
+          </w:tcPr>
+          <w:p>
+            <w:r>
+              <w:rPr>
+                <w:b/>
+                <w:sz w:val="20"/>
+              </w:rPr>
+              <w:t>Objectif</w:t>
+            </w:r>
+          </w:p>
+        </w:tc>
+        <w:tc>
+          <w:tcPr>
+            <w:tcW w:w="5169" w:type="dxa"/>
+            <w:tcBorders>
+              <w:top w:val="single" w:sz="4" w:space="0" w:color="000000"/>
+              <w:left w:val="single" w:sz="4" w:space="0" w:color="000000"/>
+              <w:bottom w:val="single" w:sz="4" w:space="0" w:color="000000"/>
+              <w:right w:val="single" w:sz="4" w:space="0" w:color="000000"/>
+            </w:tcBorders>
+          </w:tcPr>
+          <w:p>
+            <w:r>
+              <w:rPr>
+                <w:sz w:val="20"/>
+              </w:rPr>
+              <w:t>Comprendre le domaine SEO, formaliser le besoin métier de WAOO Digital, sélectionner le référentiel KPI et arrêter les choix d'architecture.</w:t>
+            </w:r>
+          </w:p>
+        </w:tc>
+      </w:tr>
+      <w:tr>
+        <w:trPr>
+          <w:jc w:val="center"/>
+        </w:trPr>
+        <w:tc>
+          <w:tcPr>
+            <w:tcW w:w="5169" w:type="dxa"/>
+            <w:tcBorders>
+              <w:top w:val="single" w:sz="4" w:space="0" w:color="000000"/>
+              <w:left w:val="single" w:sz="4" w:space="0" w:color="000000"/>
+              <w:bottom w:val="single" w:sz="4" w:space="0" w:color="000000"/>
+              <w:right w:val="single" w:sz="4" w:space="0" w:color="000000"/>
+            </w:tcBorders>
+            <w:shd w:val="clear" w:color="auto" w:fill="D9E1F2"/>
+          </w:tcPr>
+          <w:p>
+            <w:r>
+              <w:rPr>
+                <w:b/>
+                <w:sz w:val="20"/>
+              </w:rPr>
+              <w:t>Tâches principales</w:t>
+            </w:r>
+          </w:p>
+        </w:tc>
+        <w:tc>
+          <w:tcPr>
+            <w:tcW w:w="5169" w:type="dxa"/>
+            <w:tcBorders>
+              <w:top w:val="single" w:sz="4" w:space="0" w:color="000000"/>
+              <w:left w:val="single" w:sz="4" w:space="0" w:color="000000"/>
+              <w:bottom w:val="single" w:sz="4" w:space="0" w:color="000000"/>
+              <w:right w:val="single" w:sz="4" w:space="0" w:color="000000"/>
+            </w:tcBorders>
+            <w:shd w:val="clear" w:color="auto" w:fill="F2F2F2"/>
+          </w:tcPr>
+          <w:p>
+            <w:r>
+              <w:rPr>
+                <w:sz w:val="20"/>
+              </w:rPr>
+              <w:t>Étude de l'existant et des outils SEO du marché ; analyse du référentiel KPI fourni par l'encadrant (Référentiel_KPIs_SEO_GSC.pdf) ; identification des sources de données (GSC, SERP) ; choix de la stack (Node.js/Express, React/Vite, PostgreSQL/Neon, n8n, Z.AI) ; conception générale de l'architecture.</w:t>
+            </w:r>
+          </w:p>
+        </w:tc>
+      </w:tr>
+      <w:tr>
+        <w:trPr>
+          <w:jc w:val="center"/>
+        </w:trPr>
+        <w:tc>
+          <w:tcPr>
+            <w:tcW w:w="5169" w:type="dxa"/>
+            <w:tcBorders>
+              <w:top w:val="single" w:sz="4" w:space="0" w:color="000000"/>
+              <w:left w:val="single" w:sz="4" w:space="0" w:color="000000"/>
+              <w:bottom w:val="single" w:sz="4" w:space="0" w:color="000000"/>
+              <w:right w:val="single" w:sz="4" w:space="0" w:color="000000"/>
+            </w:tcBorders>
+            <w:shd w:val="clear" w:color="auto" w:fill="D9E1F2"/>
+          </w:tcPr>
+          <w:p>
+            <w:r>
+              <w:rPr>
+                <w:b/>
+                <w:sz w:val="20"/>
+              </w:rPr>
+              <w:t>Livrables</w:t>
+            </w:r>
+          </w:p>
+        </w:tc>
+        <w:tc>
+          <w:tcPr>
+            <w:tcW w:w="5169" w:type="dxa"/>
+            <w:tcBorders>
+              <w:top w:val="single" w:sz="4" w:space="0" w:color="000000"/>
+              <w:left w:val="single" w:sz="4" w:space="0" w:color="000000"/>
+              <w:bottom w:val="single" w:sz="4" w:space="0" w:color="000000"/>
+              <w:right w:val="single" w:sz="4" w:space="0" w:color="000000"/>
+            </w:tcBorders>
+          </w:tcPr>
+          <w:p>
+            <w:r>
+              <w:rPr>
+                <w:sz w:val="20"/>
+              </w:rPr>
+              <w:t>Cahier des charges, référentiel KPI validé, schéma d'architecture global.</w:t>
+            </w:r>
+          </w:p>
+        </w:tc>
+      </w:tr>
+      <w:tr>
+        <w:trPr>
+          <w:jc w:val="center"/>
+        </w:trPr>
+        <w:tc>
+          <w:tcPr>
+            <w:tcW w:w="5169" w:type="dxa"/>
+            <w:tcBorders>
+              <w:top w:val="single" w:sz="4" w:space="0" w:color="000000"/>
+              <w:left w:val="single" w:sz="4" w:space="0" w:color="000000"/>
+              <w:bottom w:val="single" w:sz="4" w:space="0" w:color="000000"/>
+              <w:right w:val="single" w:sz="4" w:space="0" w:color="000000"/>
+            </w:tcBorders>
+            <w:shd w:val="clear" w:color="auto" w:fill="D9E1F2"/>
+          </w:tcPr>
+          <w:p>
+            <w:r>
+              <w:rPr>
+                <w:b/>
+                <w:sz w:val="20"/>
+              </w:rPr>
+              <w:t>Résultat obtenu</w:t>
+            </w:r>
+          </w:p>
+        </w:tc>
+        <w:tc>
+          <w:tcPr>
+            <w:tcW w:w="5169" w:type="dxa"/>
+            <w:tcBorders>
+              <w:top w:val="single" w:sz="4" w:space="0" w:color="000000"/>
+              <w:left w:val="single" w:sz="4" w:space="0" w:color="000000"/>
+              <w:bottom w:val="single" w:sz="4" w:space="0" w:color="000000"/>
+              <w:right w:val="single" w:sz="4" w:space="0" w:color="000000"/>
+            </w:tcBorders>
+            <w:shd w:val="clear" w:color="auto" w:fill="F2F2F2"/>
+          </w:tcPr>
+          <w:p>
+            <w:r>
+              <w:rPr>
+                <w:sz w:val="20"/>
+              </w:rPr>
+              <w:t>Vision partagée du projet et fondations posées pour démarrer la réalisation.</w:t>
+            </w:r>
+          </w:p>
+        </w:tc>
+      </w:tr>
+    </w:tbl>
+    <w:p/>
+    <w:p>
+      <w:r>
+        <w:rPr>
+          <w:b/>
+        </w:rPr>
+        <w:t>Sprint 2 — Socle technique et gestion des projets</w:t>
+      </w:r>
+    </w:p>
+    <w:tbl>
+      <w:tblPr>
+        <w:tblW w:w="0" w:type="auto"/>
+        <w:jc w:val="center"/>
+        <w:tblLook w:val="04A0" w:firstRow="1" w:lastRow="0" w:firstColumn="1" w:lastColumn="0" w:noHBand="0" w:noVBand="1"/>
+      </w:tblPr>
+      <w:tblGrid>
+        <w:gridCol w:w="5169"/>
+        <w:gridCol w:w="5169"/>
+      </w:tblGrid>
+      <w:tr>
+        <w:trPr>
+          <w:jc w:val="center"/>
+        </w:trPr>
+        <w:tc>
+          <w:tcPr>
+            <w:tcW w:w="5169" w:type="dxa"/>
+            <w:tcBorders>
+              <w:top w:val="single" w:sz="4" w:space="0" w:color="000000"/>
+              <w:left w:val="single" w:sz="4" w:space="0" w:color="000000"/>
+              <w:bottom w:val="single" w:sz="4" w:space="0" w:color="000000"/>
+              <w:right w:val="single" w:sz="4" w:space="0" w:color="000000"/>
+            </w:tcBorders>
+            <w:shd w:val="clear" w:color="auto" w:fill="D9E1F2"/>
+          </w:tcPr>
+          <w:p>
+            <w:r>
+              <w:rPr>
+                <w:b/>
+                <w:sz w:val="20"/>
+              </w:rPr>
+              <w:t>Objectif</w:t>
+            </w:r>
+          </w:p>
+        </w:tc>
+        <w:tc>
+          <w:tcPr>
+            <w:tcW w:w="5169" w:type="dxa"/>
+            <w:tcBorders>
+              <w:top w:val="single" w:sz="4" w:space="0" w:color="000000"/>
+              <w:left w:val="single" w:sz="4" w:space="0" w:color="000000"/>
+              <w:bottom w:val="single" w:sz="4" w:space="0" w:color="000000"/>
+              <w:right w:val="single" w:sz="4" w:space="0" w:color="000000"/>
+            </w:tcBorders>
+          </w:tcPr>
+          <w:p>
+            <w:r>
+              <w:rPr>
+                <w:sz w:val="20"/>
+              </w:rPr>
+              <w:t>Mettre en place l'environnement technique et les fonctionnalités d'authentification et de gestion des projets SEO.</w:t>
+            </w:r>
+          </w:p>
+        </w:tc>
+      </w:tr>
+      <w:tr>
+        <w:trPr>
+          <w:jc w:val="center"/>
+        </w:trPr>
+        <w:tc>
+          <w:tcPr>
+            <w:tcW w:w="5169" w:type="dxa"/>
+            <w:tcBorders>
+              <w:top w:val="single" w:sz="4" w:space="0" w:color="000000"/>
+              <w:left w:val="single" w:sz="4" w:space="0" w:color="000000"/>
+              <w:bottom w:val="single" w:sz="4" w:space="0" w:color="000000"/>
+              <w:right w:val="single" w:sz="4" w:space="0" w:color="000000"/>
+            </w:tcBorders>
+            <w:shd w:val="clear" w:color="auto" w:fill="D9E1F2"/>
+          </w:tcPr>
+          <w:p>
+            <w:r>
+              <w:rPr>
+                <w:b/>
+                <w:sz w:val="20"/>
+              </w:rPr>
+              <w:t>Tâches principales</w:t>
+            </w:r>
+          </w:p>
+        </w:tc>
+        <w:tc>
+          <w:tcPr>
+            <w:tcW w:w="5169" w:type="dxa"/>
+            <w:tcBorders>
+              <w:top w:val="single" w:sz="4" w:space="0" w:color="000000"/>
+              <w:left w:val="single" w:sz="4" w:space="0" w:color="000000"/>
+              <w:bottom w:val="single" w:sz="4" w:space="0" w:color="000000"/>
+              <w:right w:val="single" w:sz="4" w:space="0" w:color="000000"/>
+            </w:tcBorders>
+            <w:shd w:val="clear" w:color="auto" w:fill="F2F2F2"/>
+          </w:tcPr>
+          <w:p>
+            <w:r>
+              <w:rPr>
+                <w:sz w:val="20"/>
+              </w:rPr>
+              <w:t>Initialisation du dépôt et de la chaîne de build (Vite intégré à Express sur un port unique) ; création du schéma PostgreSQL et de la procédure initDb idempotente ; authentification JWT ; CRUD des projets SEO ; page Login et restauration de session côté frontend.</w:t>
+            </w:r>
+          </w:p>
+        </w:tc>
+      </w:tr>
+      <w:tr>
+        <w:trPr>
+          <w:jc w:val="center"/>
+        </w:trPr>
+        <w:tc>
+          <w:tcPr>
+            <w:tcW w:w="5169" w:type="dxa"/>
+            <w:tcBorders>
+              <w:top w:val="single" w:sz="4" w:space="0" w:color="000000"/>
+              <w:left w:val="single" w:sz="4" w:space="0" w:color="000000"/>
+              <w:bottom w:val="single" w:sz="4" w:space="0" w:color="000000"/>
+              <w:right w:val="single" w:sz="4" w:space="0" w:color="000000"/>
+            </w:tcBorders>
+            <w:shd w:val="clear" w:color="auto" w:fill="D9E1F2"/>
+          </w:tcPr>
+          <w:p>
+            <w:r>
+              <w:rPr>
+                <w:b/>
+                <w:sz w:val="20"/>
+              </w:rPr>
+              <w:t>Livrables</w:t>
+            </w:r>
+          </w:p>
+        </w:tc>
+        <w:tc>
+          <w:tcPr>
+            <w:tcW w:w="5169" w:type="dxa"/>
+            <w:tcBorders>
+              <w:top w:val="single" w:sz="4" w:space="0" w:color="000000"/>
+              <w:left w:val="single" w:sz="4" w:space="0" w:color="000000"/>
+              <w:bottom w:val="single" w:sz="4" w:space="0" w:color="000000"/>
+              <w:right w:val="single" w:sz="4" w:space="0" w:color="000000"/>
+            </w:tcBorders>
+          </w:tcPr>
+          <w:p>
+            <w:r>
+              <w:rPr>
+                <w:sz w:val="20"/>
+              </w:rPr>
+              <w:t>API d'authentification, gestion des projets, schéma de base de données initial.</w:t>
+            </w:r>
+          </w:p>
+        </w:tc>
+      </w:tr>
+      <w:tr>
+        <w:trPr>
+          <w:jc w:val="center"/>
+        </w:trPr>
+        <w:tc>
+          <w:tcPr>
+            <w:tcW w:w="5169" w:type="dxa"/>
+            <w:tcBorders>
+              <w:top w:val="single" w:sz="4" w:space="0" w:color="000000"/>
+              <w:left w:val="single" w:sz="4" w:space="0" w:color="000000"/>
+              <w:bottom w:val="single" w:sz="4" w:space="0" w:color="000000"/>
+              <w:right w:val="single" w:sz="4" w:space="0" w:color="000000"/>
+            </w:tcBorders>
+            <w:shd w:val="clear" w:color="auto" w:fill="D9E1F2"/>
+          </w:tcPr>
+          <w:p>
+            <w:r>
+              <w:rPr>
+                <w:b/>
+                <w:sz w:val="20"/>
+              </w:rPr>
+              <w:t>Résultat obtenu</w:t>
+            </w:r>
+          </w:p>
+        </w:tc>
+        <w:tc>
+          <w:tcPr>
+            <w:tcW w:w="5169" w:type="dxa"/>
+            <w:tcBorders>
+              <w:top w:val="single" w:sz="4" w:space="0" w:color="000000"/>
+              <w:left w:val="single" w:sz="4" w:space="0" w:color="000000"/>
+              <w:bottom w:val="single" w:sz="4" w:space="0" w:color="000000"/>
+              <w:right w:val="single" w:sz="4" w:space="0" w:color="000000"/>
+            </w:tcBorders>
+            <w:shd w:val="clear" w:color="auto" w:fill="F2F2F2"/>
+          </w:tcPr>
+          <w:p>
+            <w:r>
+              <w:rPr>
+                <w:sz w:val="20"/>
+              </w:rPr>
+              <w:t>Application capable d'accueillir des utilisateurs et de gérer plusieurs projets SEO.</w:t>
+            </w:r>
+          </w:p>
+        </w:tc>
+      </w:tr>
+    </w:tbl>
+    <w:p/>
+    <w:p>
+      <w:r>
+        <w:rPr>
+          <w:b/>
+        </w:rPr>
+        <w:t>Sprint 3 — Pipeline d'ingestion n8n</w:t>
+      </w:r>
+    </w:p>
+    <w:tbl>
+      <w:tblPr>
+        <w:tblW w:w="0" w:type="auto"/>
+        <w:jc w:val="center"/>
+        <w:tblLook w:val="04A0" w:firstRow="1" w:lastRow="0" w:firstColumn="1" w:lastColumn="0" w:noHBand="0" w:noVBand="1"/>
+      </w:tblPr>
+      <w:tblGrid>
+        <w:gridCol w:w="5169"/>
+        <w:gridCol w:w="5169"/>
+      </w:tblGrid>
+      <w:tr>
+        <w:trPr>
+          <w:jc w:val="center"/>
+        </w:trPr>
+        <w:tc>
+          <w:tcPr>
+            <w:tcW w:w="5169" w:type="dxa"/>
+            <w:tcBorders>
+              <w:top w:val="single" w:sz="4" w:space="0" w:color="000000"/>
+              <w:left w:val="single" w:sz="4" w:space="0" w:color="000000"/>
+              <w:bottom w:val="single" w:sz="4" w:space="0" w:color="000000"/>
+              <w:right w:val="single" w:sz="4" w:space="0" w:color="000000"/>
+            </w:tcBorders>
+            <w:shd w:val="clear" w:color="auto" w:fill="D9E1F2"/>
+          </w:tcPr>
+          <w:p>
+            <w:r>
+              <w:rPr>
+                <w:b/>
+                <w:sz w:val="20"/>
+              </w:rPr>
+              <w:t>Objectif</w:t>
+            </w:r>
+          </w:p>
+        </w:tc>
+        <w:tc>
+          <w:tcPr>
+            <w:tcW w:w="5169" w:type="dxa"/>
+            <w:tcBorders>
+              <w:top w:val="single" w:sz="4" w:space="0" w:color="000000"/>
+              <w:left w:val="single" w:sz="4" w:space="0" w:color="000000"/>
+              <w:bottom w:val="single" w:sz="4" w:space="0" w:color="000000"/>
+              <w:right w:val="single" w:sz="4" w:space="0" w:color="000000"/>
+            </w:tcBorders>
+          </w:tcPr>
+          <w:p>
+            <w:r>
+              <w:rPr>
+                <w:sz w:val="20"/>
+              </w:rPr>
+              <w:t>Automatiser la collecte et le stockage des données SEO issues de Google Search Console et de l'API SERP.</w:t>
+            </w:r>
+          </w:p>
+        </w:tc>
+      </w:tr>
+      <w:tr>
+        <w:trPr>
+          <w:jc w:val="center"/>
+        </w:trPr>
+        <w:tc>
+          <w:tcPr>
+            <w:tcW w:w="5169" w:type="dxa"/>
+            <w:tcBorders>
+              <w:top w:val="single" w:sz="4" w:space="0" w:color="000000"/>
+              <w:left w:val="single" w:sz="4" w:space="0" w:color="000000"/>
+              <w:bottom w:val="single" w:sz="4" w:space="0" w:color="000000"/>
+              <w:right w:val="single" w:sz="4" w:space="0" w:color="000000"/>
+            </w:tcBorders>
+            <w:shd w:val="clear" w:color="auto" w:fill="D9E1F2"/>
+          </w:tcPr>
+          <w:p>
+            <w:r>
+              <w:rPr>
+                <w:b/>
+                <w:sz w:val="20"/>
+              </w:rPr>
+              <w:t>Tâches principales</w:t>
+            </w:r>
+          </w:p>
+        </w:tc>
+        <w:tc>
+          <w:tcPr>
+            <w:tcW w:w="5169" w:type="dxa"/>
+            <w:tcBorders>
+              <w:top w:val="single" w:sz="4" w:space="0" w:color="000000"/>
+              <w:left w:val="single" w:sz="4" w:space="0" w:color="000000"/>
+              <w:bottom w:val="single" w:sz="4" w:space="0" w:color="000000"/>
+              <w:right w:val="single" w:sz="4" w:space="0" w:color="000000"/>
+            </w:tcBorders>
+            <w:shd w:val="clear" w:color="auto" w:fill="F2F2F2"/>
+          </w:tcPr>
+          <w:p>
+            <w:r>
+              <w:rPr>
+                <w:sz w:val="20"/>
+              </w:rPr>
+              <w:t>Conception des workflows n8n GSC et SERP ; mise en place des routes d'ingestion sécurisées par clé API (x-api-key) ; nettoyage et normalisation des payloads ; alimentation des tables gsc_daily et serp_daily ; route de déclenchement manuel /api/n8n/trigger.</w:t>
+            </w:r>
+          </w:p>
+        </w:tc>
+      </w:tr>
+      <w:tr>
+        <w:trPr>
+          <w:jc w:val="center"/>
+        </w:trPr>
+        <w:tc>
+          <w:tcPr>
+            <w:tcW w:w="5169" w:type="dxa"/>
+            <w:tcBorders>
+              <w:top w:val="single" w:sz="4" w:space="0" w:color="000000"/>
+              <w:left w:val="single" w:sz="4" w:space="0" w:color="000000"/>
+              <w:bottom w:val="single" w:sz="4" w:space="0" w:color="000000"/>
+              <w:right w:val="single" w:sz="4" w:space="0" w:color="000000"/>
+            </w:tcBorders>
+            <w:shd w:val="clear" w:color="auto" w:fill="D9E1F2"/>
+          </w:tcPr>
+          <w:p>
+            <w:r>
+              <w:rPr>
+                <w:b/>
+                <w:sz w:val="20"/>
+              </w:rPr>
+              <w:t>Livrables</w:t>
+            </w:r>
+          </w:p>
+        </w:tc>
+        <w:tc>
+          <w:tcPr>
+            <w:tcW w:w="5169" w:type="dxa"/>
+            <w:tcBorders>
+              <w:top w:val="single" w:sz="4" w:space="0" w:color="000000"/>
+              <w:left w:val="single" w:sz="4" w:space="0" w:color="000000"/>
+              <w:bottom w:val="single" w:sz="4" w:space="0" w:color="000000"/>
+              <w:right w:val="single" w:sz="4" w:space="0" w:color="000000"/>
+            </w:tcBorders>
+          </w:tcPr>
+          <w:p>
+            <w:r>
+              <w:rPr>
+                <w:sz w:val="20"/>
+              </w:rPr>
+              <w:t>Workflows n8n actifs, routes /api/ingest/gsc et /api/ingest/serp opérationnelles.</w:t>
+            </w:r>
+          </w:p>
+        </w:tc>
+      </w:tr>
+      <w:tr>
+        <w:trPr>
+          <w:jc w:val="center"/>
+        </w:trPr>
+        <w:tc>
+          <w:tcPr>
+            <w:tcW w:w="5169" w:type="dxa"/>
+            <w:tcBorders>
+              <w:top w:val="single" w:sz="4" w:space="0" w:color="000000"/>
+              <w:left w:val="single" w:sz="4" w:space="0" w:color="000000"/>
+              <w:bottom w:val="single" w:sz="4" w:space="0" w:color="000000"/>
+              <w:right w:val="single" w:sz="4" w:space="0" w:color="000000"/>
+            </w:tcBorders>
+            <w:shd w:val="clear" w:color="auto" w:fill="D9E1F2"/>
+          </w:tcPr>
+          <w:p>
+            <w:r>
+              <w:rPr>
+                <w:b/>
+                <w:sz w:val="20"/>
+              </w:rPr>
+              <w:t>Résultat obtenu</w:t>
+            </w:r>
+          </w:p>
+        </w:tc>
+        <w:tc>
+          <w:tcPr>
+            <w:tcW w:w="5169" w:type="dxa"/>
+            <w:tcBorders>
+              <w:top w:val="single" w:sz="4" w:space="0" w:color="000000"/>
+              <w:left w:val="single" w:sz="4" w:space="0" w:color="000000"/>
+              <w:bottom w:val="single" w:sz="4" w:space="0" w:color="000000"/>
+              <w:right w:val="single" w:sz="4" w:space="0" w:color="000000"/>
+            </w:tcBorders>
+            <w:shd w:val="clear" w:color="auto" w:fill="F2F2F2"/>
+          </w:tcPr>
+          <w:p>
+            <w:r>
+              <w:rPr>
+                <w:sz w:val="20"/>
+              </w:rPr>
+              <w:t>Données SEO collectées quotidiennement et centralisées dans PostgreSQL.</w:t>
+            </w:r>
+          </w:p>
+        </w:tc>
+      </w:tr>
+    </w:tbl>
+    <w:p/>
+    <w:p>
+      <w:r>
+        <w:rPr>
+          <w:b/>
+        </w:rPr>
+        <w:t>Sprint 4 — Calcul des indicateurs décisionnels</w:t>
+      </w:r>
+    </w:p>
+    <w:tbl>
+      <w:tblPr>
+        <w:tblW w:w="0" w:type="auto"/>
+        <w:jc w:val="center"/>
+        <w:tblLook w:val="04A0" w:firstRow="1" w:lastRow="0" w:firstColumn="1" w:lastColumn="0" w:noHBand="0" w:noVBand="1"/>
+      </w:tblPr>
+      <w:tblGrid>
+        <w:gridCol w:w="5169"/>
+        <w:gridCol w:w="5169"/>
+      </w:tblGrid>
+      <w:tr>
+        <w:trPr>
+          <w:jc w:val="center"/>
+        </w:trPr>
+        <w:tc>
+          <w:tcPr>
+            <w:tcW w:w="5169" w:type="dxa"/>
+            <w:tcBorders>
+              <w:top w:val="single" w:sz="4" w:space="0" w:color="000000"/>
+              <w:left w:val="single" w:sz="4" w:space="0" w:color="000000"/>
+              <w:bottom w:val="single" w:sz="4" w:space="0" w:color="000000"/>
+              <w:right w:val="single" w:sz="4" w:space="0" w:color="000000"/>
+            </w:tcBorders>
+            <w:shd w:val="clear" w:color="auto" w:fill="D9E1F2"/>
+          </w:tcPr>
+          <w:p>
+            <w:r>
+              <w:rPr>
+                <w:b/>
+                <w:sz w:val="20"/>
+              </w:rPr>
+              <w:t>Objectif</w:t>
+            </w:r>
+          </w:p>
+        </w:tc>
+        <w:tc>
+          <w:tcPr>
+            <w:tcW w:w="5169" w:type="dxa"/>
+            <w:tcBorders>
+              <w:top w:val="single" w:sz="4" w:space="0" w:color="000000"/>
+              <w:left w:val="single" w:sz="4" w:space="0" w:color="000000"/>
+              <w:bottom w:val="single" w:sz="4" w:space="0" w:color="000000"/>
+              <w:right w:val="single" w:sz="4" w:space="0" w:color="000000"/>
+            </w:tcBorders>
+          </w:tcPr>
+          <w:p>
+            <w:r>
+              <w:rPr>
+                <w:sz w:val="20"/>
+              </w:rPr>
+              <w:t>Implémenter la couche métier décisionnelle conforme au référentiel SEO/GSC.</w:t>
+            </w:r>
+          </w:p>
+        </w:tc>
+      </w:tr>
+      <w:tr>
+        <w:trPr>
+          <w:jc w:val="center"/>
+        </w:trPr>
+        <w:tc>
+          <w:tcPr>
+            <w:tcW w:w="5169" w:type="dxa"/>
+            <w:tcBorders>
+              <w:top w:val="single" w:sz="4" w:space="0" w:color="000000"/>
+              <w:left w:val="single" w:sz="4" w:space="0" w:color="000000"/>
+              <w:bottom w:val="single" w:sz="4" w:space="0" w:color="000000"/>
+              <w:right w:val="single" w:sz="4" w:space="0" w:color="000000"/>
+            </w:tcBorders>
+            <w:shd w:val="clear" w:color="auto" w:fill="D9E1F2"/>
+          </w:tcPr>
+          <w:p>
+            <w:r>
+              <w:rPr>
+                <w:b/>
+                <w:sz w:val="20"/>
+              </w:rPr>
+              <w:t>Tâches principales</w:t>
+            </w:r>
+          </w:p>
+        </w:tc>
+        <w:tc>
+          <w:tcPr>
+            <w:tcW w:w="5169" w:type="dxa"/>
+            <w:tcBorders>
+              <w:top w:val="single" w:sz="4" w:space="0" w:color="000000"/>
+              <w:left w:val="single" w:sz="4" w:space="0" w:color="000000"/>
+              <w:bottom w:val="single" w:sz="4" w:space="0" w:color="000000"/>
+              <w:right w:val="single" w:sz="4" w:space="0" w:color="000000"/>
+            </w:tcBorders>
+            <w:shd w:val="clear" w:color="auto" w:fill="F2F2F2"/>
+          </w:tcPr>
+          <w:p>
+            <w:r>
+              <w:rPr>
+                <w:sz w:val="20"/>
+              </w:rPr>
+              <w:t>Formalisation et implémentation des KPIs (opportunity_score, quick_win_score, ctr_gap, performance_drift, priority_score, competition_score) ; création de la table scores_daily ; mise en place du recalcul automatique à chaque ingestion via /api/compute/kpis ; définition des seuils d'alerte (drift ≥ 5, opportunity_score ≥ 200).</w:t>
+            </w:r>
+          </w:p>
+        </w:tc>
+      </w:tr>
+      <w:tr>
+        <w:trPr>
+          <w:jc w:val="center"/>
+        </w:trPr>
+        <w:tc>
+          <w:tcPr>
+            <w:tcW w:w="5169" w:type="dxa"/>
+            <w:tcBorders>
+              <w:top w:val="single" w:sz="4" w:space="0" w:color="000000"/>
+              <w:left w:val="single" w:sz="4" w:space="0" w:color="000000"/>
+              <w:bottom w:val="single" w:sz="4" w:space="0" w:color="000000"/>
+              <w:right w:val="single" w:sz="4" w:space="0" w:color="000000"/>
+            </w:tcBorders>
+            <w:shd w:val="clear" w:color="auto" w:fill="D9E1F2"/>
+          </w:tcPr>
+          <w:p>
+            <w:r>
+              <w:rPr>
+                <w:b/>
+                <w:sz w:val="20"/>
+              </w:rPr>
+              <w:t>Livrables</w:t>
+            </w:r>
+          </w:p>
+        </w:tc>
+        <w:tc>
+          <w:tcPr>
+            <w:tcW w:w="5169" w:type="dxa"/>
+            <w:tcBorders>
+              <w:top w:val="single" w:sz="4" w:space="0" w:color="000000"/>
+              <w:left w:val="single" w:sz="4" w:space="0" w:color="000000"/>
+              <w:bottom w:val="single" w:sz="4" w:space="0" w:color="000000"/>
+              <w:right w:val="single" w:sz="4" w:space="0" w:color="000000"/>
+            </w:tcBorders>
+          </w:tcPr>
+          <w:p>
+            <w:r>
+              <w:rPr>
+                <w:sz w:val="20"/>
+              </w:rPr>
+              <w:t>Module de calcul KPI, table scores_daily, route /api/compute/kpis.</w:t>
+            </w:r>
+          </w:p>
+        </w:tc>
+      </w:tr>
+      <w:tr>
+        <w:trPr>
+          <w:jc w:val="center"/>
+        </w:trPr>
+        <w:tc>
+          <w:tcPr>
+            <w:tcW w:w="5169" w:type="dxa"/>
+            <w:tcBorders>
+              <w:top w:val="single" w:sz="4" w:space="0" w:color="000000"/>
+              <w:left w:val="single" w:sz="4" w:space="0" w:color="000000"/>
+              <w:bottom w:val="single" w:sz="4" w:space="0" w:color="000000"/>
+              <w:right w:val="single" w:sz="4" w:space="0" w:color="000000"/>
+            </w:tcBorders>
+            <w:shd w:val="clear" w:color="auto" w:fill="D9E1F2"/>
+          </w:tcPr>
+          <w:p>
+            <w:r>
+              <w:rPr>
+                <w:b/>
+                <w:sz w:val="20"/>
+              </w:rPr>
+              <w:t>Résultat obtenu</w:t>
+            </w:r>
+          </w:p>
+        </w:tc>
+        <w:tc>
+          <w:tcPr>
+            <w:tcW w:w="5169" w:type="dxa"/>
+            <w:tcBorders>
+              <w:top w:val="single" w:sz="4" w:space="0" w:color="000000"/>
+              <w:left w:val="single" w:sz="4" w:space="0" w:color="000000"/>
+              <w:bottom w:val="single" w:sz="4" w:space="0" w:color="000000"/>
+              <w:right w:val="single" w:sz="4" w:space="0" w:color="000000"/>
+            </w:tcBorders>
+            <w:shd w:val="clear" w:color="auto" w:fill="F2F2F2"/>
+          </w:tcPr>
+          <w:p>
+            <w:r>
+              <w:rPr>
+                <w:sz w:val="20"/>
+              </w:rPr>
+              <w:t>Indicateurs décisionnels disponibles par mot-clé et par date, prêts à être exploités par l'interface.</w:t>
+            </w:r>
+          </w:p>
+        </w:tc>
+      </w:tr>
+    </w:tbl>
+    <w:p/>
+    <w:p>
+      <w:r>
+        <w:rPr>
+          <w:b/>
+        </w:rPr>
+        <w:t>Sprint 5 — Qualification NLP et intégration IA</w:t>
+      </w:r>
+    </w:p>
+    <w:tbl>
+      <w:tblPr>
+        <w:tblW w:w="0" w:type="auto"/>
+        <w:jc w:val="center"/>
+        <w:tblLook w:val="04A0" w:firstRow="1" w:lastRow="0" w:firstColumn="1" w:lastColumn="0" w:noHBand="0" w:noVBand="1"/>
+      </w:tblPr>
+      <w:tblGrid>
+        <w:gridCol w:w="5169"/>
+        <w:gridCol w:w="5169"/>
+      </w:tblGrid>
+      <w:tr>
+        <w:trPr>
+          <w:jc w:val="center"/>
+        </w:trPr>
+        <w:tc>
+          <w:tcPr>
+            <w:tcW w:w="5169" w:type="dxa"/>
+            <w:tcBorders>
+              <w:top w:val="single" w:sz="4" w:space="0" w:color="000000"/>
+              <w:left w:val="single" w:sz="4" w:space="0" w:color="000000"/>
+              <w:bottom w:val="single" w:sz="4" w:space="0" w:color="000000"/>
+              <w:right w:val="single" w:sz="4" w:space="0" w:color="000000"/>
+            </w:tcBorders>
+            <w:shd w:val="clear" w:color="auto" w:fill="D9E1F2"/>
+          </w:tcPr>
+          <w:p>
+            <w:r>
+              <w:rPr>
+                <w:b/>
+                <w:sz w:val="20"/>
+              </w:rPr>
+              <w:t>Objectif</w:t>
+            </w:r>
+          </w:p>
+        </w:tc>
+        <w:tc>
+          <w:tcPr>
+            <w:tcW w:w="5169" w:type="dxa"/>
+            <w:tcBorders>
+              <w:top w:val="single" w:sz="4" w:space="0" w:color="000000"/>
+              <w:left w:val="single" w:sz="4" w:space="0" w:color="000000"/>
+              <w:bottom w:val="single" w:sz="4" w:space="0" w:color="000000"/>
+              <w:right w:val="single" w:sz="4" w:space="0" w:color="000000"/>
+            </w:tcBorders>
+          </w:tcPr>
+          <w:p>
+            <w:r>
+              <w:rPr>
+                <w:sz w:val="20"/>
+              </w:rPr>
+              <w:t>Enrichir les mots-clés par un pipeline NLP combinant règles locales et intelligence artificielle.</w:t>
+            </w:r>
+          </w:p>
+        </w:tc>
+      </w:tr>
+      <w:tr>
+        <w:trPr>
+          <w:jc w:val="center"/>
+        </w:trPr>
+        <w:tc>
+          <w:tcPr>
+            <w:tcW w:w="5169" w:type="dxa"/>
+            <w:tcBorders>
+              <w:top w:val="single" w:sz="4" w:space="0" w:color="000000"/>
+              <w:left w:val="single" w:sz="4" w:space="0" w:color="000000"/>
+              <w:bottom w:val="single" w:sz="4" w:space="0" w:color="000000"/>
+              <w:right w:val="single" w:sz="4" w:space="0" w:color="000000"/>
+            </w:tcBorders>
+            <w:shd w:val="clear" w:color="auto" w:fill="D9E1F2"/>
+          </w:tcPr>
+          <w:p>
+            <w:r>
+              <w:rPr>
+                <w:b/>
+                <w:sz w:val="20"/>
+              </w:rPr>
+              <w:t>Tâches principales</w:t>
+            </w:r>
+          </w:p>
+        </w:tc>
+        <w:tc>
+          <w:tcPr>
+            <w:tcW w:w="5169" w:type="dxa"/>
+            <w:tcBorders>
+              <w:top w:val="single" w:sz="4" w:space="0" w:color="000000"/>
+              <w:left w:val="single" w:sz="4" w:space="0" w:color="000000"/>
+              <w:bottom w:val="single" w:sz="4" w:space="0" w:color="000000"/>
+              <w:right w:val="single" w:sz="4" w:space="0" w:color="000000"/>
+            </w:tcBorders>
+            <w:shd w:val="clear" w:color="auto" w:fill="F2F2F2"/>
+          </w:tcPr>
+          <w:p>
+            <w:r>
+              <w:rPr>
+                <w:sz w:val="20"/>
+              </w:rPr>
+              <w:t xml:space="preserve">Implémentation des règles métier (intention transactionnelle, navigationnelle, informationnelle, marque, type de traîne) ; intégration de l'API Z.AI via le SDK OpenAI pour les mots-clés à confiance faible ; persistance dans </w:t>
+            </w:r>
+            <w:r>
+              <w:rPr>
+                <w:sz w:val="20"/>
+              </w:rPr>
+              <w:lastRenderedPageBreak/>
+              <w:t>nlp_keyword_enrichment ; développement du clustering sémantique et du plan d'action générés par l'IA.</w:t>
+            </w:r>
+          </w:p>
+        </w:tc>
+      </w:tr>
+      <w:tr>
+        <w:trPr>
+          <w:jc w:val="center"/>
+        </w:trPr>
+        <w:tc>
+          <w:tcPr>
+            <w:tcW w:w="5169" w:type="dxa"/>
+            <w:tcBorders>
+              <w:top w:val="single" w:sz="4" w:space="0" w:color="000000"/>
+              <w:left w:val="single" w:sz="4" w:space="0" w:color="000000"/>
+              <w:bottom w:val="single" w:sz="4" w:space="0" w:color="000000"/>
+              <w:right w:val="single" w:sz="4" w:space="0" w:color="000000"/>
+            </w:tcBorders>
+            <w:shd w:val="clear" w:color="auto" w:fill="D9E1F2"/>
+          </w:tcPr>
+          <w:p>
+            <w:r>
+              <w:rPr>
+                <w:b/>
+                <w:sz w:val="20"/>
+              </w:rPr>
+              <w:lastRenderedPageBreak/>
+              <w:t>Livrables</w:t>
+            </w:r>
+          </w:p>
+        </w:tc>
+        <w:tc>
+          <w:tcPr>
+            <w:tcW w:w="5169" w:type="dxa"/>
+            <w:tcBorders>
+              <w:top w:val="single" w:sz="4" w:space="0" w:color="000000"/>
+              <w:left w:val="single" w:sz="4" w:space="0" w:color="000000"/>
+              <w:bottom w:val="single" w:sz="4" w:space="0" w:color="000000"/>
+              <w:right w:val="single" w:sz="4" w:space="0" w:color="000000"/>
+            </w:tcBorders>
+          </w:tcPr>
+          <w:p>
+            <w:pPr>
+              <w:rPr>
+                <w:lang w:val="en-US"/>
+              </w:rPr>
+            </w:pPr>
+            <w:r>
+              <w:rPr>
+                <w:sz w:val="20"/>
+                <w:lang w:val="en-US"/>
+              </w:rPr>
+              <w:t>Routes /</w:t>
+            </w:r>
+            <w:proofErr w:type="spellStart"/>
+            <w:r>
+              <w:rPr>
+                <w:sz w:val="20"/>
+                <w:lang w:val="en-US"/>
+              </w:rPr>
+              <w:t>api</w:t>
+            </w:r>
+            <w:proofErr w:type="spellEnd"/>
+            <w:r>
+              <w:rPr>
+                <w:sz w:val="20"/>
+                <w:lang w:val="en-US"/>
+              </w:rPr>
+              <w:t>/</w:t>
+            </w:r>
+            <w:proofErr w:type="spellStart"/>
+            <w:r>
+              <w:rPr>
+                <w:sz w:val="20"/>
+                <w:lang w:val="en-US"/>
+              </w:rPr>
+              <w:t>nlp</w:t>
+            </w:r>
+            <w:proofErr w:type="spellEnd"/>
+            <w:r>
+              <w:rPr>
+                <w:sz w:val="20"/>
+                <w:lang w:val="en-US"/>
+              </w:rPr>
+              <w:t>/qualify, /</w:t>
+            </w:r>
+            <w:proofErr w:type="spellStart"/>
+            <w:r>
+              <w:rPr>
+                <w:sz w:val="20"/>
+                <w:lang w:val="en-US"/>
+              </w:rPr>
+              <w:t>api</w:t>
+            </w:r>
+            <w:proofErr w:type="spellEnd"/>
+            <w:r>
+              <w:rPr>
+                <w:sz w:val="20"/>
+                <w:lang w:val="en-US"/>
+              </w:rPr>
+              <w:t>/projects/:id/cluster, /</w:t>
+            </w:r>
+            <w:proofErr w:type="spellStart"/>
+            <w:r>
+              <w:rPr>
+                <w:sz w:val="20"/>
+                <w:lang w:val="en-US"/>
+              </w:rPr>
+              <w:t>api</w:t>
+            </w:r>
+            <w:proofErr w:type="spellEnd"/>
+            <w:r>
+              <w:rPr>
+                <w:sz w:val="20"/>
+                <w:lang w:val="en-US"/>
+              </w:rPr>
+              <w:t>/projects/:id/action-</w:t>
+            </w:r>
+            <w:proofErr w:type="gramStart"/>
+            <w:r>
+              <w:rPr>
+                <w:sz w:val="20"/>
+                <w:lang w:val="en-US"/>
+              </w:rPr>
+              <w:t>plan ;</w:t>
+            </w:r>
+            <w:proofErr w:type="gramEnd"/>
+            <w:r>
+              <w:rPr>
+                <w:sz w:val="20"/>
+                <w:lang w:val="en-US"/>
+              </w:rPr>
+              <w:t xml:space="preserve"> table </w:t>
+            </w:r>
+            <w:proofErr w:type="spellStart"/>
+            <w:r>
+              <w:rPr>
+                <w:sz w:val="20"/>
+                <w:lang w:val="en-US"/>
+              </w:rPr>
+              <w:t>nlp_keyword_enrichment</w:t>
+            </w:r>
+            <w:proofErr w:type="spellEnd"/>
+            <w:r>
+              <w:rPr>
+                <w:sz w:val="20"/>
+                <w:lang w:val="en-US"/>
+              </w:rPr>
+              <w:t xml:space="preserve"> </w:t>
+            </w:r>
+            <w:proofErr w:type="spellStart"/>
+            <w:r>
+              <w:rPr>
+                <w:sz w:val="20"/>
+                <w:lang w:val="en-US"/>
+              </w:rPr>
+              <w:t>alimentée</w:t>
+            </w:r>
+            <w:proofErr w:type="spellEnd"/>
+            <w:r>
+              <w:rPr>
+                <w:sz w:val="20"/>
+                <w:lang w:val="en-US"/>
+              </w:rPr>
+              <w:t>.</w:t>
+            </w:r>
+          </w:p>
+        </w:tc>
+      </w:tr>
+      <w:tr>
+        <w:trPr>
+          <w:jc w:val="center"/>
+        </w:trPr>
+        <w:tc>
+          <w:tcPr>
+            <w:tcW w:w="5169" w:type="dxa"/>
+            <w:tcBorders>
+              <w:top w:val="single" w:sz="4" w:space="0" w:color="000000"/>
+              <w:left w:val="single" w:sz="4" w:space="0" w:color="000000"/>
+              <w:bottom w:val="single" w:sz="4" w:space="0" w:color="000000"/>
+              <w:right w:val="single" w:sz="4" w:space="0" w:color="000000"/>
+            </w:tcBorders>
+            <w:shd w:val="clear" w:color="auto" w:fill="D9E1F2"/>
+          </w:tcPr>
+          <w:p>
+            <w:r>
+              <w:rPr>
+                <w:b/>
+                <w:sz w:val="20"/>
+              </w:rPr>
+              <w:t>Résultat obtenu</w:t>
+            </w:r>
+          </w:p>
+        </w:tc>
+        <w:tc>
+          <w:tcPr>
+            <w:tcW w:w="5169" w:type="dxa"/>
+            <w:tcBorders>
+              <w:top w:val="single" w:sz="4" w:space="0" w:color="000000"/>
+              <w:left w:val="single" w:sz="4" w:space="0" w:color="000000"/>
+              <w:bottom w:val="single" w:sz="4" w:space="0" w:color="000000"/>
+              <w:right w:val="single" w:sz="4" w:space="0" w:color="000000"/>
+            </w:tcBorders>
+            <w:shd w:val="clear" w:color="auto" w:fill="F2F2F2"/>
+          </w:tcPr>
+          <w:p>
+            <w:r>
+              <w:rPr>
+                <w:sz w:val="20"/>
+              </w:rPr>
+              <w:t>Mots-clés qualifiés automatiquement, clusters et plan d'action exploitables dans l'interface.</w:t>
+            </w:r>
+          </w:p>
+        </w:tc>
+      </w:tr>
+    </w:tbl>
+    <w:p/>
+    <w:p>
+      <w:r>
+        <w:rPr>
+          <w:b/>
+        </w:rPr>
+        <w:t>Sprint 6 — Interfaces décisionnelles</w:t>
+      </w:r>
+    </w:p>
+    <w:tbl>
+      <w:tblPr>
+        <w:tblW w:w="0" w:type="auto"/>
+        <w:jc w:val="center"/>
+        <w:tblLook w:val="04A0" w:firstRow="1" w:lastRow="0" w:firstColumn="1" w:lastColumn="0" w:noHBand="0" w:noVBand="1"/>
+      </w:tblPr>
+      <w:tblGrid>
+        <w:gridCol w:w="5169"/>
+        <w:gridCol w:w="5169"/>
+      </w:tblGrid>
+      <w:tr>
+        <w:trPr>
+          <w:jc w:val="center"/>
+        </w:trPr>
+        <w:tc>
+          <w:tcPr>
+            <w:tcW w:w="5169" w:type="dxa"/>
+            <w:tcBorders>
+              <w:top w:val="single" w:sz="4" w:space="0" w:color="000000"/>
+              <w:left w:val="single" w:sz="4" w:space="0" w:color="000000"/>
+              <w:bottom w:val="single" w:sz="4" w:space="0" w:color="000000"/>
+              <w:right w:val="single" w:sz="4" w:space="0" w:color="000000"/>
+            </w:tcBorders>
+            <w:shd w:val="clear" w:color="auto" w:fill="D9E1F2"/>
+          </w:tcPr>
+          <w:p>
+            <w:r>
+              <w:rPr>
+                <w:b/>
+                <w:sz w:val="20"/>
+              </w:rPr>
+              <w:t>Objectif</w:t>
+            </w:r>
+          </w:p>
+        </w:tc>
+        <w:tc>
+          <w:tcPr>
+            <w:tcW w:w="5169" w:type="dxa"/>
+            <w:tcBorders>
+              <w:top w:val="single" w:sz="4" w:space="0" w:color="000000"/>
+              <w:left w:val="single" w:sz="4" w:space="0" w:color="000000"/>
+              <w:bottom w:val="single" w:sz="4" w:space="0" w:color="000000"/>
+              <w:right w:val="single" w:sz="4" w:space="0" w:color="000000"/>
+            </w:tcBorders>
+          </w:tcPr>
+          <w:p>
+            <w:r>
+              <w:rPr>
+                <w:sz w:val="20"/>
+              </w:rPr>
+              <w:t>Construire les pages d'analyse exploitées au quotidien par l'analyste SEO.</w:t>
+            </w:r>
+          </w:p>
+        </w:tc>
+      </w:tr>
+      <w:tr>
+        <w:trPr>
+          <w:jc w:val="center"/>
+        </w:trPr>
+        <w:tc>
+          <w:tcPr>
+            <w:tcW w:w="5169" w:type="dxa"/>
+            <w:tcBorders>
+              <w:top w:val="single" w:sz="4" w:space="0" w:color="000000"/>
+              <w:left w:val="single" w:sz="4" w:space="0" w:color="000000"/>
+              <w:bottom w:val="single" w:sz="4" w:space="0" w:color="000000"/>
+              <w:right w:val="single" w:sz="4" w:space="0" w:color="000000"/>
+            </w:tcBorders>
+            <w:shd w:val="clear" w:color="auto" w:fill="D9E1F2"/>
+          </w:tcPr>
+          <w:p>
+            <w:r>
+              <w:rPr>
+                <w:b/>
+                <w:sz w:val="20"/>
+              </w:rPr>
+              <w:t>Tâches principales</w:t>
+            </w:r>
+          </w:p>
+        </w:tc>
+        <w:tc>
+          <w:tcPr>
+            <w:tcW w:w="5169" w:type="dxa"/>
+            <w:tcBorders>
+              <w:top w:val="single" w:sz="4" w:space="0" w:color="000000"/>
+              <w:left w:val="single" w:sz="4" w:space="0" w:color="000000"/>
+              <w:bottom w:val="single" w:sz="4" w:space="0" w:color="000000"/>
+              <w:right w:val="single" w:sz="4" w:space="0" w:color="000000"/>
+            </w:tcBorders>
+            <w:shd w:val="clear" w:color="auto" w:fill="F2F2F2"/>
+          </w:tcPr>
+          <w:p>
+            <w:r>
+              <w:rPr>
+                <w:sz w:val="20"/>
+              </w:rPr>
+              <w:t>Développement du Dashboard (cartes KPI pondérées, courbes de trafic, répartition branded, alertes) ; page Opportunités avec tri par opportunity_score et visualisation Position × Score ; page Suivi exploitant l'indicateur is_tracked et l'évolution de la position ; page Paramètres ; mise en cohérence visuelle (Tailwind, Recharts).</w:t>
+            </w:r>
+          </w:p>
+        </w:tc>
+      </w:tr>
+      <w:tr>
+        <w:trPr>
+          <w:jc w:val="center"/>
+        </w:trPr>
+        <w:tc>
+          <w:tcPr>
+            <w:tcW w:w="5169" w:type="dxa"/>
+            <w:tcBorders>
+              <w:top w:val="single" w:sz="4" w:space="0" w:color="000000"/>
+              <w:left w:val="single" w:sz="4" w:space="0" w:color="000000"/>
+              <w:bottom w:val="single" w:sz="4" w:space="0" w:color="000000"/>
+              <w:right w:val="single" w:sz="4" w:space="0" w:color="000000"/>
+            </w:tcBorders>
+            <w:shd w:val="clear" w:color="auto" w:fill="D9E1F2"/>
+          </w:tcPr>
+          <w:p>
+            <w:r>
+              <w:rPr>
+                <w:b/>
+                <w:sz w:val="20"/>
+              </w:rPr>
+              <w:t>Livrables</w:t>
+            </w:r>
+          </w:p>
+        </w:tc>
+        <w:tc>
+          <w:tcPr>
+            <w:tcW w:w="5169" w:type="dxa"/>
+            <w:tcBorders>
+              <w:top w:val="single" w:sz="4" w:space="0" w:color="000000"/>
+              <w:left w:val="single" w:sz="4" w:space="0" w:color="000000"/>
+              <w:bottom w:val="single" w:sz="4" w:space="0" w:color="000000"/>
+              <w:right w:val="single" w:sz="4" w:space="0" w:color="000000"/>
+            </w:tcBorders>
+          </w:tcPr>
+          <w:p>
+            <w:r>
+              <w:rPr>
+                <w:sz w:val="20"/>
+              </w:rPr>
+              <w:t>Pages Dashboard, Opportunités, Suivi et Paramètres fonctionnelles.</w:t>
+            </w:r>
+          </w:p>
+        </w:tc>
+      </w:tr>
+      <w:tr>
+        <w:trPr>
+          <w:jc w:val="center"/>
+        </w:trPr>
+        <w:tc>
+          <w:tcPr>
+            <w:tcW w:w="5169" w:type="dxa"/>
+            <w:tcBorders>
+              <w:top w:val="single" w:sz="4" w:space="0" w:color="000000"/>
+              <w:left w:val="single" w:sz="4" w:space="0" w:color="000000"/>
+              <w:bottom w:val="single" w:sz="4" w:space="0" w:color="000000"/>
+              <w:right w:val="single" w:sz="4" w:space="0" w:color="000000"/>
+            </w:tcBorders>
+            <w:shd w:val="clear" w:color="auto" w:fill="D9E1F2"/>
+          </w:tcPr>
+          <w:p>
+            <w:r>
+              <w:rPr>
+                <w:b/>
+                <w:sz w:val="20"/>
+              </w:rPr>
+              <w:t>Résultat obtenu</w:t>
+            </w:r>
+          </w:p>
+        </w:tc>
+        <w:tc>
+          <w:tcPr>
+            <w:tcW w:w="5169" w:type="dxa"/>
+            <w:tcBorders>
+              <w:top w:val="single" w:sz="4" w:space="0" w:color="000000"/>
+              <w:left w:val="single" w:sz="4" w:space="0" w:color="000000"/>
+              <w:bottom w:val="single" w:sz="4" w:space="0" w:color="000000"/>
+              <w:right w:val="single" w:sz="4" w:space="0" w:color="000000"/>
+            </w:tcBorders>
+            <w:shd w:val="clear" w:color="auto" w:fill="F2F2F2"/>
+          </w:tcPr>
+          <w:p>
+            <w:r>
+              <w:rPr>
+                <w:sz w:val="20"/>
+              </w:rPr>
+              <w:t>Interface décisionnelle complète, permettant à l'analyste d'explorer les performances SEO.</w:t>
+            </w:r>
+          </w:p>
+        </w:tc>
+      </w:tr>
+    </w:tbl>
+    <w:p/>
+    <w:p>
+      <w:r>
+        <w:rPr>
+          <w:b/>
+        </w:rPr>
+        <w:t>Sprint 7 — Assistant saisonnier, tests et finalisation</w:t>
+      </w:r>
+    </w:p>
+    <w:tbl>
+      <w:tblPr>
+        <w:tblW w:w="0" w:type="auto"/>
+        <w:jc w:val="center"/>
+        <w:tblLook w:val="04A0" w:firstRow="1" w:lastRow="0" w:firstColumn="1" w:lastColumn="0" w:noHBand="0" w:noVBand="1"/>
+      </w:tblPr>
+      <w:tblGrid>
+        <w:gridCol w:w="5169"/>
+        <w:gridCol w:w="5169"/>
+      </w:tblGrid>
+      <w:tr>
+        <w:trPr>
+          <w:jc w:val="center"/>
+        </w:trPr>
+        <w:tc>
+          <w:tcPr>
+            <w:tcW w:w="5169" w:type="dxa"/>
+            <w:tcBorders>
+              <w:top w:val="single" w:sz="4" w:space="0" w:color="000000"/>
+              <w:left w:val="single" w:sz="4" w:space="0" w:color="000000"/>
+              <w:bottom w:val="single" w:sz="4" w:space="0" w:color="000000"/>
+              <w:right w:val="single" w:sz="4" w:space="0" w:color="000000"/>
+            </w:tcBorders>
+            <w:shd w:val="clear" w:color="auto" w:fill="D9E1F2"/>
+          </w:tcPr>
+          <w:p>
+            <w:r>
+              <w:rPr>
+                <w:b/>
+                <w:sz w:val="20"/>
+              </w:rPr>
+              <w:t>Objectif</w:t>
+            </w:r>
+          </w:p>
+        </w:tc>
+        <w:tc>
+          <w:tcPr>
+            <w:tcW w:w="5169" w:type="dxa"/>
+            <w:tcBorders>
+              <w:top w:val="single" w:sz="4" w:space="0" w:color="000000"/>
+              <w:left w:val="single" w:sz="4" w:space="0" w:color="000000"/>
+              <w:bottom w:val="single" w:sz="4" w:space="0" w:color="000000"/>
+              <w:right w:val="single" w:sz="4" w:space="0" w:color="000000"/>
+            </w:tcBorders>
+          </w:tcPr>
+          <w:p>
+            <w:r>
+              <w:rPr>
+                <w:sz w:val="20"/>
+              </w:rPr>
+              <w:t>Finaliser l'application avec l'assistant conversationnel, vérifier la cohérence des données et rédiger le rapport.</w:t>
+            </w:r>
+          </w:p>
+        </w:tc>
+      </w:tr>
+      <w:tr>
+        <w:trPr>
+          <w:jc w:val="center"/>
+        </w:trPr>
+        <w:tc>
+          <w:tcPr>
+            <w:tcW w:w="5169" w:type="dxa"/>
+            <w:tcBorders>
+              <w:top w:val="single" w:sz="4" w:space="0" w:color="000000"/>
+              <w:left w:val="single" w:sz="4" w:space="0" w:color="000000"/>
+              <w:bottom w:val="single" w:sz="4" w:space="0" w:color="000000"/>
+              <w:right w:val="single" w:sz="4" w:space="0" w:color="000000"/>
+            </w:tcBorders>
+            <w:shd w:val="clear" w:color="auto" w:fill="D9E1F2"/>
+          </w:tcPr>
+          <w:p>
+            <w:r>
+              <w:rPr>
+                <w:b/>
+                <w:sz w:val="20"/>
+              </w:rPr>
+              <w:t>Tâches principales</w:t>
+            </w:r>
+          </w:p>
+        </w:tc>
+        <w:tc>
+          <w:tcPr>
+            <w:tcW w:w="5169" w:type="dxa"/>
+            <w:tcBorders>
+              <w:top w:val="single" w:sz="4" w:space="0" w:color="000000"/>
+              <w:left w:val="single" w:sz="4" w:space="0" w:color="000000"/>
+              <w:bottom w:val="single" w:sz="4" w:space="0" w:color="000000"/>
+              <w:right w:val="single" w:sz="4" w:space="0" w:color="000000"/>
+            </w:tcBorders>
+            <w:shd w:val="clear" w:color="auto" w:fill="F2F2F2"/>
+          </w:tcPr>
+          <w:p>
+            <w:r>
+              <w:rPr>
+                <w:sz w:val="20"/>
+              </w:rPr>
+              <w:t>Développement de l'assistant saisonnier en streaming SSE (page Calendrier) ; mise en place de l'endpoint de diagnostic /api/debug/data-check ; tests fonctionnels et de cohérence sur les jointures gsc_daily / scores_daily ; corrections d'UX et d'accessibilité ; rédaction et mise au propre du rapport.</w:t>
+            </w:r>
+          </w:p>
+        </w:tc>
+      </w:tr>
+      <w:tr>
+        <w:trPr>
+          <w:jc w:val="center"/>
+        </w:trPr>
+        <w:tc>
+          <w:tcPr>
+            <w:tcW w:w="5169" w:type="dxa"/>
+            <w:tcBorders>
+              <w:top w:val="single" w:sz="4" w:space="0" w:color="000000"/>
+              <w:left w:val="single" w:sz="4" w:space="0" w:color="000000"/>
+              <w:bottom w:val="single" w:sz="4" w:space="0" w:color="000000"/>
+              <w:right w:val="single" w:sz="4" w:space="0" w:color="000000"/>
+            </w:tcBorders>
+            <w:shd w:val="clear" w:color="auto" w:fill="D9E1F2"/>
+          </w:tcPr>
+          <w:p>
+            <w:r>
+              <w:rPr>
+                <w:b/>
+                <w:sz w:val="20"/>
+              </w:rPr>
+              <w:t>Livrables</w:t>
+            </w:r>
+          </w:p>
+        </w:tc>
+        <w:tc>
+          <w:tcPr>
+            <w:tcW w:w="5169" w:type="dxa"/>
+            <w:tcBorders>
+              <w:top w:val="single" w:sz="4" w:space="0" w:color="000000"/>
+              <w:left w:val="single" w:sz="4" w:space="0" w:color="000000"/>
+              <w:bottom w:val="single" w:sz="4" w:space="0" w:color="000000"/>
+              <w:right w:val="single" w:sz="4" w:space="0" w:color="000000"/>
+            </w:tcBorders>
+          </w:tcPr>
+          <w:p>
+            <w:r>
+              <w:rPr>
+                <w:sz w:val="20"/>
+              </w:rPr>
+              <w:t>Assistant saisonnier opérationnel, endpoint de diagnostic, application stabilisée, rapport finalisé.</w:t>
+            </w:r>
+          </w:p>
+        </w:tc>
+      </w:tr>
+      <w:tr>
+        <w:trPr>
+          <w:jc w:val="center"/>
+        </w:trPr>
+        <w:tc>
+          <w:tcPr>
+            <w:tcW w:w="5169" w:type="dxa"/>
+            <w:tcBorders>
+              <w:top w:val="single" w:sz="4" w:space="0" w:color="000000"/>
+              <w:left w:val="single" w:sz="4" w:space="0" w:color="000000"/>
+              <w:bottom w:val="single" w:sz="4" w:space="0" w:color="000000"/>
+              <w:right w:val="single" w:sz="4" w:space="0" w:color="000000"/>
+            </w:tcBorders>
+            <w:shd w:val="clear" w:color="auto" w:fill="D9E1F2"/>
+          </w:tcPr>
+          <w:p>
+            <w:r>
+              <w:rPr>
+                <w:b/>
+                <w:sz w:val="20"/>
+              </w:rPr>
+              <w:t>Résultat obtenu</w:t>
+            </w:r>
+          </w:p>
+        </w:tc>
+        <w:tc>
+          <w:tcPr>
+            <w:tcW w:w="5169" w:type="dxa"/>
+            <w:tcBorders>
+              <w:top w:val="single" w:sz="4" w:space="0" w:color="000000"/>
+              <w:left w:val="single" w:sz="4" w:space="0" w:color="000000"/>
+              <w:bottom w:val="single" w:sz="4" w:space="0" w:color="000000"/>
+              <w:right w:val="single" w:sz="4" w:space="0" w:color="000000"/>
+            </w:tcBorders>
+            <w:shd w:val="clear" w:color="auto" w:fill="F2F2F2"/>
+          </w:tcPr>
+          <w:p>
+            <w:r>
+              <w:rPr>
+                <w:sz w:val="20"/>
+              </w:rPr>
+              <w:t>Solution complète, testée et documentée, prête pour la soutenance.</w:t>
+            </w:r>
+          </w:p>
+        </w:tc>
+      </w:tr>
+    </w:tbl>
+    <w:p/>
+    <w:p>
+      <w:r>
+        <w:rPr>
+          <w:b/>
+        </w:rPr>
+        <w:t>Suivi inspiré du Daily Scrum</w:t>
+      </w:r>
+    </w:p>
+    <w:p>
+      <w:r>
+        <w:t>Sans formaliser de réunion quotidienne stricte, l'équipe a maintenu un suivi régulier inspiré du Daily Scrum. Des points d'avancement courts ont été tenus plusieurs fois par semaine au sein du trinôme et avec les encadrants, autour de trois questions : ce qui a été réalisé depuis le dernier point, les obstacles rencontrés et les tâches à engager ensuite. Cette discipline a permis d'identifier rapidement les blocages techniques, de réajuster les priorités et de garder le projet aligné avec les attentes du Product Owner.</w:t>
+      </w:r>
+    </w:p>
+    <w:p>
+      <w:r>
+        <w:rPr>
+          <w:b/>
+        </w:rPr>
+        <w:t>Sprint Review et Sprint Retrospective</w:t>
+      </w:r>
+    </w:p>
+    <w:p>
+      <w:r>
+        <w:t>À l'issue de chaque sprint, deux temps d'analyse ont été organisés.</w:t>
+      </w:r>
+    </w:p>
+    <w:p>
+      <w:r>
+        <w:t>La Sprint Review consiste à présenter les livrables produits à l'encadrant entreprise et à l'encadrant pédagogique afin de valider leur conformité fonctionnelle. Elle a porté, selon les sprints, sur la mise en route du pipeline d'ingestion, sur la qualité des indicateurs calculés, sur la pertinence des opportunités remontées par l'interface ou encore sur le comportement de l'assistant saisonnier.</w:t>
+      </w:r>
+    </w:p>
+    <w:p>
+      <w:r>
+        <w:t>La Sprint Retrospective vise à analyser le déroulement du sprint pour améliorer l'organisation et les choix techniques. Plusieurs ajustements significatifs en sont issus : affinement du référentiel KPI après confrontation aux données réelles GSC, remplacement du fournisseur de modèle de langage initialement envisagé par l'API Z.AI (plus adaptée et compatible avec le SDK OpenAI), simplification du serveur en une entrée unique Express + Vite, ajustement de la logique de calcul de la dérive de performance sur 28 jours, et améliorations d'ergonomie sur les pages Opportunités et Suivi à la suite des retours utilisateur.</w:t>
+      </w:r>
+    </w:p>
+    <w:p/>
     <w:p>
       <w:pPr>
         <w:pStyle w:val="Titre1"/>
@@ -12776,6 +16517,7 @@
           <w:b/>
           <w:spacing w:val="-2"/>
         </w:rPr>
+        <w:lastRenderedPageBreak/>
         <w:t>Authentification</w:t>
       </w:r>
     </w:p>

</xml_diff>